<commit_message>
Update CA1 report: temperature range, skewness, missing values, class balance, normal vs failed comparison
</commit_message>
<xml_diff>
--- a/CA 1 DA.docx
+++ b/CA 1 DA.docx
@@ -201,56 +201,28 @@
           <w:sz w:val="32"/>
           <w:szCs w:val="32"/>
         </w:rPr>
-        <w:t>Contin</w:t>
-      </w:r>
-      <w:r>
+        <w:t>Continuous Assessment 1</w:t>
+      </w:r>
+    </w:p>
+    <w:p>
+      <w:pPr>
+        <w:jc w:val="center"/>
+      </w:pPr>
+    </w:p>
+    <w:p>
+      <w:pPr>
+        <w:jc w:val="center"/>
         <w:rPr>
           <w:sz w:val="32"/>
           <w:szCs w:val="32"/>
         </w:rPr>
-        <w:t>u</w:t>
-      </w:r>
+      </w:pPr>
       <w:r>
         <w:rPr>
           <w:sz w:val="32"/>
           <w:szCs w:val="32"/>
         </w:rPr>
-        <w:t>ous Assessment 1</w:t>
-      </w:r>
-    </w:p>
-    <w:p>
-      <w:pPr>
-        <w:jc w:val="center"/>
-      </w:pPr>
-    </w:p>
-    <w:p>
-      <w:pPr>
-        <w:jc w:val="center"/>
-        <w:rPr>
-          <w:sz w:val="32"/>
-          <w:szCs w:val="32"/>
-        </w:rPr>
-      </w:pPr>
-      <w:r>
-        <w:rPr>
-          <w:sz w:val="32"/>
-          <w:szCs w:val="32"/>
-        </w:rPr>
-        <w:t>February</w:t>
-      </w:r>
-      <w:r>
-        <w:rPr>
-          <w:sz w:val="32"/>
-          <w:szCs w:val="32"/>
-        </w:rPr>
-        <w:t xml:space="preserve"> 20</w:t>
-      </w:r>
-      <w:r>
-        <w:rPr>
-          <w:sz w:val="32"/>
-          <w:szCs w:val="32"/>
-        </w:rPr>
-        <w:t>24</w:t>
+        <w:t xml:space="preserve">February 2024</w:t>
       </w:r>
     </w:p>
     <w:p/>
@@ -391,46 +363,10 @@
                 <w:webHidden/>
               </w:rPr>
               <w:tab/>
-            </w:r>
-            <w:r>
-              <w:rPr>
-                <w:noProof/>
-                <w:webHidden/>
-              </w:rPr>
               <w:fldChar w:fldCharType="begin"/>
-            </w:r>
-            <w:r>
-              <w:rPr>
-                <w:noProof/>
-                <w:webHidden/>
-              </w:rPr>
               <w:instrText xml:space="preserve"> PAGEREF _Toc159784653 \h </w:instrText>
-            </w:r>
-            <w:r>
-              <w:rPr>
-                <w:noProof/>
-                <w:webHidden/>
-              </w:rPr>
-            </w:r>
-            <w:r>
-              <w:rPr>
-                <w:noProof/>
-                <w:webHidden/>
-              </w:rPr>
               <w:fldChar w:fldCharType="separate"/>
-            </w:r>
-            <w:r>
-              <w:rPr>
-                <w:noProof/>
-                <w:webHidden/>
-              </w:rPr>
               <w:t>3</w:t>
-            </w:r>
-            <w:r>
-              <w:rPr>
-                <w:noProof/>
-                <w:webHidden/>
-              </w:rPr>
               <w:fldChar w:fldCharType="end"/>
             </w:r>
           </w:hyperlink>
@@ -483,46 +419,10 @@
                 <w:webHidden/>
               </w:rPr>
               <w:tab/>
-            </w:r>
-            <w:r>
-              <w:rPr>
-                <w:noProof/>
-                <w:webHidden/>
-              </w:rPr>
               <w:fldChar w:fldCharType="begin"/>
-            </w:r>
-            <w:r>
-              <w:rPr>
-                <w:noProof/>
-                <w:webHidden/>
-              </w:rPr>
               <w:instrText xml:space="preserve"> PAGEREF _Toc159784654 \h </w:instrText>
-            </w:r>
-            <w:r>
-              <w:rPr>
-                <w:noProof/>
-                <w:webHidden/>
-              </w:rPr>
-            </w:r>
-            <w:r>
-              <w:rPr>
-                <w:noProof/>
-                <w:webHidden/>
-              </w:rPr>
               <w:fldChar w:fldCharType="separate"/>
-            </w:r>
-            <w:r>
-              <w:rPr>
-                <w:noProof/>
-                <w:webHidden/>
-              </w:rPr>
               <w:t>3</w:t>
-            </w:r>
-            <w:r>
-              <w:rPr>
-                <w:noProof/>
-                <w:webHidden/>
-              </w:rPr>
               <w:fldChar w:fldCharType="end"/>
             </w:r>
           </w:hyperlink>
@@ -579,46 +479,10 @@
                 <w:webHidden/>
               </w:rPr>
               <w:tab/>
-            </w:r>
-            <w:r>
-              <w:rPr>
-                <w:noProof/>
-                <w:webHidden/>
-              </w:rPr>
               <w:fldChar w:fldCharType="begin"/>
-            </w:r>
-            <w:r>
-              <w:rPr>
-                <w:noProof/>
-                <w:webHidden/>
-              </w:rPr>
               <w:instrText xml:space="preserve"> PAGEREF _Toc159784655 \h </w:instrText>
-            </w:r>
-            <w:r>
-              <w:rPr>
-                <w:noProof/>
-                <w:webHidden/>
-              </w:rPr>
-            </w:r>
-            <w:r>
-              <w:rPr>
-                <w:noProof/>
-                <w:webHidden/>
-              </w:rPr>
               <w:fldChar w:fldCharType="separate"/>
-            </w:r>
-            <w:r>
-              <w:rPr>
-                <w:noProof/>
-                <w:webHidden/>
-              </w:rPr>
               <w:t>3</w:t>
-            </w:r>
-            <w:r>
-              <w:rPr>
-                <w:noProof/>
-                <w:webHidden/>
-              </w:rPr>
               <w:fldChar w:fldCharType="end"/>
             </w:r>
           </w:hyperlink>
@@ -675,46 +539,10 @@
                 <w:webHidden/>
               </w:rPr>
               <w:tab/>
-            </w:r>
-            <w:r>
-              <w:rPr>
-                <w:noProof/>
-                <w:webHidden/>
-              </w:rPr>
               <w:fldChar w:fldCharType="begin"/>
-            </w:r>
-            <w:r>
-              <w:rPr>
-                <w:noProof/>
-                <w:webHidden/>
-              </w:rPr>
               <w:instrText xml:space="preserve"> PAGEREF _Toc159784656 \h </w:instrText>
-            </w:r>
-            <w:r>
-              <w:rPr>
-                <w:noProof/>
-                <w:webHidden/>
-              </w:rPr>
-            </w:r>
-            <w:r>
-              <w:rPr>
-                <w:noProof/>
-                <w:webHidden/>
-              </w:rPr>
               <w:fldChar w:fldCharType="separate"/>
-            </w:r>
-            <w:r>
-              <w:rPr>
-                <w:noProof/>
-                <w:webHidden/>
-              </w:rPr>
               <w:t>3</w:t>
-            </w:r>
-            <w:r>
-              <w:rPr>
-                <w:noProof/>
-                <w:webHidden/>
-              </w:rPr>
               <w:fldChar w:fldCharType="end"/>
             </w:r>
           </w:hyperlink>
@@ -771,46 +599,10 @@
                 <w:webHidden/>
               </w:rPr>
               <w:tab/>
-            </w:r>
-            <w:r>
-              <w:rPr>
-                <w:noProof/>
-                <w:webHidden/>
-              </w:rPr>
               <w:fldChar w:fldCharType="begin"/>
-            </w:r>
-            <w:r>
-              <w:rPr>
-                <w:noProof/>
-                <w:webHidden/>
-              </w:rPr>
               <w:instrText xml:space="preserve"> PAGEREF _Toc159784657 \h </w:instrText>
-            </w:r>
-            <w:r>
-              <w:rPr>
-                <w:noProof/>
-                <w:webHidden/>
-              </w:rPr>
-            </w:r>
-            <w:r>
-              <w:rPr>
-                <w:noProof/>
-                <w:webHidden/>
-              </w:rPr>
               <w:fldChar w:fldCharType="separate"/>
-            </w:r>
-            <w:r>
-              <w:rPr>
-                <w:noProof/>
-                <w:webHidden/>
-              </w:rPr>
               <w:t>4</w:t>
-            </w:r>
-            <w:r>
-              <w:rPr>
-                <w:noProof/>
-                <w:webHidden/>
-              </w:rPr>
               <w:fldChar w:fldCharType="end"/>
             </w:r>
           </w:hyperlink>
@@ -867,46 +659,10 @@
                 <w:webHidden/>
               </w:rPr>
               <w:tab/>
-            </w:r>
-            <w:r>
-              <w:rPr>
-                <w:noProof/>
-                <w:webHidden/>
-              </w:rPr>
               <w:fldChar w:fldCharType="begin"/>
-            </w:r>
-            <w:r>
-              <w:rPr>
-                <w:noProof/>
-                <w:webHidden/>
-              </w:rPr>
               <w:instrText xml:space="preserve"> PAGEREF _Toc159784658 \h </w:instrText>
-            </w:r>
-            <w:r>
-              <w:rPr>
-                <w:noProof/>
-                <w:webHidden/>
-              </w:rPr>
-            </w:r>
-            <w:r>
-              <w:rPr>
-                <w:noProof/>
-                <w:webHidden/>
-              </w:rPr>
               <w:fldChar w:fldCharType="separate"/>
-            </w:r>
-            <w:r>
-              <w:rPr>
-                <w:noProof/>
-                <w:webHidden/>
-              </w:rPr>
               <w:t>4</w:t>
-            </w:r>
-            <w:r>
-              <w:rPr>
-                <w:noProof/>
-                <w:webHidden/>
-              </w:rPr>
               <w:fldChar w:fldCharType="end"/>
             </w:r>
           </w:hyperlink>
@@ -963,46 +719,10 @@
                 <w:webHidden/>
               </w:rPr>
               <w:tab/>
-            </w:r>
-            <w:r>
-              <w:rPr>
-                <w:noProof/>
-                <w:webHidden/>
-              </w:rPr>
               <w:fldChar w:fldCharType="begin"/>
-            </w:r>
-            <w:r>
-              <w:rPr>
-                <w:noProof/>
-                <w:webHidden/>
-              </w:rPr>
               <w:instrText xml:space="preserve"> PAGEREF _Toc159784659 \h </w:instrText>
-            </w:r>
-            <w:r>
-              <w:rPr>
-                <w:noProof/>
-                <w:webHidden/>
-              </w:rPr>
-            </w:r>
-            <w:r>
-              <w:rPr>
-                <w:noProof/>
-                <w:webHidden/>
-              </w:rPr>
               <w:fldChar w:fldCharType="separate"/>
-            </w:r>
-            <w:r>
-              <w:rPr>
-                <w:noProof/>
-                <w:webHidden/>
-              </w:rPr>
               <w:t>5</w:t>
-            </w:r>
-            <w:r>
-              <w:rPr>
-                <w:noProof/>
-                <w:webHidden/>
-              </w:rPr>
               <w:fldChar w:fldCharType="end"/>
             </w:r>
           </w:hyperlink>
@@ -1057,46 +777,10 @@
                 <w:webHidden/>
               </w:rPr>
               <w:tab/>
-            </w:r>
-            <w:r>
-              <w:rPr>
-                <w:noProof/>
-                <w:webHidden/>
-              </w:rPr>
               <w:fldChar w:fldCharType="begin"/>
-            </w:r>
-            <w:r>
-              <w:rPr>
-                <w:noProof/>
-                <w:webHidden/>
-              </w:rPr>
               <w:instrText xml:space="preserve"> PAGEREF _Toc159784660 \h </w:instrText>
-            </w:r>
-            <w:r>
-              <w:rPr>
-                <w:noProof/>
-                <w:webHidden/>
-              </w:rPr>
-            </w:r>
-            <w:r>
-              <w:rPr>
-                <w:noProof/>
-                <w:webHidden/>
-              </w:rPr>
               <w:fldChar w:fldCharType="separate"/>
-            </w:r>
-            <w:r>
-              <w:rPr>
-                <w:noProof/>
-                <w:webHidden/>
-              </w:rPr>
               <w:t>6</w:t>
-            </w:r>
-            <w:r>
-              <w:rPr>
-                <w:noProof/>
-                <w:webHidden/>
-              </w:rPr>
               <w:fldChar w:fldCharType="end"/>
             </w:r>
           </w:hyperlink>
@@ -1132,46 +816,10 @@
                 <w:webHidden/>
               </w:rPr>
               <w:tab/>
-            </w:r>
-            <w:r>
-              <w:rPr>
-                <w:noProof/>
-                <w:webHidden/>
-              </w:rPr>
               <w:fldChar w:fldCharType="begin"/>
-            </w:r>
-            <w:r>
-              <w:rPr>
-                <w:noProof/>
-                <w:webHidden/>
-              </w:rPr>
               <w:instrText xml:space="preserve"> PAGEREF _Toc159784661 \h </w:instrText>
-            </w:r>
-            <w:r>
-              <w:rPr>
-                <w:noProof/>
-                <w:webHidden/>
-              </w:rPr>
-            </w:r>
-            <w:r>
-              <w:rPr>
-                <w:noProof/>
-                <w:webHidden/>
-              </w:rPr>
               <w:fldChar w:fldCharType="separate"/>
-            </w:r>
-            <w:r>
-              <w:rPr>
-                <w:noProof/>
-                <w:webHidden/>
-              </w:rPr>
               <w:t>6</w:t>
-            </w:r>
-            <w:r>
-              <w:rPr>
-                <w:noProof/>
-                <w:webHidden/>
-              </w:rPr>
               <w:fldChar w:fldCharType="end"/>
             </w:r>
           </w:hyperlink>
@@ -1224,46 +872,10 @@
                 <w:webHidden/>
               </w:rPr>
               <w:tab/>
-            </w:r>
-            <w:r>
-              <w:rPr>
-                <w:noProof/>
-                <w:webHidden/>
-              </w:rPr>
               <w:fldChar w:fldCharType="begin"/>
-            </w:r>
-            <w:r>
-              <w:rPr>
-                <w:noProof/>
-                <w:webHidden/>
-              </w:rPr>
               <w:instrText xml:space="preserve"> PAGEREF _Toc159784662 \h </w:instrText>
-            </w:r>
-            <w:r>
-              <w:rPr>
-                <w:noProof/>
-                <w:webHidden/>
-              </w:rPr>
-            </w:r>
-            <w:r>
-              <w:rPr>
-                <w:noProof/>
-                <w:webHidden/>
-              </w:rPr>
               <w:fldChar w:fldCharType="separate"/>
-            </w:r>
-            <w:r>
-              <w:rPr>
-                <w:noProof/>
-                <w:webHidden/>
-              </w:rPr>
               <w:t>6</w:t>
-            </w:r>
-            <w:r>
-              <w:rPr>
-                <w:noProof/>
-                <w:webHidden/>
-              </w:rPr>
               <w:fldChar w:fldCharType="end"/>
             </w:r>
           </w:hyperlink>
@@ -1318,46 +930,10 @@
                 <w:webHidden/>
               </w:rPr>
               <w:tab/>
-            </w:r>
-            <w:r>
-              <w:rPr>
-                <w:noProof/>
-                <w:webHidden/>
-              </w:rPr>
               <w:fldChar w:fldCharType="begin"/>
-            </w:r>
-            <w:r>
-              <w:rPr>
-                <w:noProof/>
-                <w:webHidden/>
-              </w:rPr>
               <w:instrText xml:space="preserve"> PAGEREF _Toc159784663 \h </w:instrText>
-            </w:r>
-            <w:r>
-              <w:rPr>
-                <w:noProof/>
-                <w:webHidden/>
-              </w:rPr>
-            </w:r>
-            <w:r>
-              <w:rPr>
-                <w:noProof/>
-                <w:webHidden/>
-              </w:rPr>
               <w:fldChar w:fldCharType="separate"/>
-            </w:r>
-            <w:r>
-              <w:rPr>
-                <w:noProof/>
-                <w:webHidden/>
-              </w:rPr>
               <w:t>7</w:t>
-            </w:r>
-            <w:r>
-              <w:rPr>
-                <w:noProof/>
-                <w:webHidden/>
-              </w:rPr>
               <w:fldChar w:fldCharType="end"/>
             </w:r>
           </w:hyperlink>
@@ -1395,46 +971,10 @@
                 <w:webHidden/>
               </w:rPr>
               <w:tab/>
-            </w:r>
-            <w:r>
-              <w:rPr>
-                <w:noProof/>
-                <w:webHidden/>
-              </w:rPr>
               <w:fldChar w:fldCharType="begin"/>
-            </w:r>
-            <w:r>
-              <w:rPr>
-                <w:noProof/>
-                <w:webHidden/>
-              </w:rPr>
               <w:instrText xml:space="preserve"> PAGEREF _Toc159784664 \h </w:instrText>
-            </w:r>
-            <w:r>
-              <w:rPr>
-                <w:noProof/>
-                <w:webHidden/>
-              </w:rPr>
-            </w:r>
-            <w:r>
-              <w:rPr>
-                <w:noProof/>
-                <w:webHidden/>
-              </w:rPr>
               <w:fldChar w:fldCharType="separate"/>
-            </w:r>
-            <w:r>
-              <w:rPr>
-                <w:noProof/>
-                <w:webHidden/>
-              </w:rPr>
               <w:t>10</w:t>
-            </w:r>
-            <w:r>
-              <w:rPr>
-                <w:noProof/>
-                <w:webHidden/>
-              </w:rPr>
               <w:fldChar w:fldCharType="end"/>
             </w:r>
           </w:hyperlink>
@@ -1469,46 +1009,10 @@
                 <w:webHidden/>
               </w:rPr>
               <w:tab/>
-            </w:r>
-            <w:r>
-              <w:rPr>
-                <w:noProof/>
-                <w:webHidden/>
-              </w:rPr>
               <w:fldChar w:fldCharType="begin"/>
-            </w:r>
-            <w:r>
-              <w:rPr>
-                <w:noProof/>
-                <w:webHidden/>
-              </w:rPr>
               <w:instrText xml:space="preserve"> PAGEREF _Toc159784665 \h </w:instrText>
-            </w:r>
-            <w:r>
-              <w:rPr>
-                <w:noProof/>
-                <w:webHidden/>
-              </w:rPr>
-            </w:r>
-            <w:r>
-              <w:rPr>
-                <w:noProof/>
-                <w:webHidden/>
-              </w:rPr>
               <w:fldChar w:fldCharType="separate"/>
-            </w:r>
-            <w:r>
-              <w:rPr>
-                <w:noProof/>
-                <w:webHidden/>
-              </w:rPr>
               <w:t>10</w:t>
-            </w:r>
-            <w:r>
-              <w:rPr>
-                <w:noProof/>
-                <w:webHidden/>
-              </w:rPr>
               <w:fldChar w:fldCharType="end"/>
             </w:r>
           </w:hyperlink>
@@ -1543,46 +1047,10 @@
                 <w:webHidden/>
               </w:rPr>
               <w:tab/>
-            </w:r>
-            <w:r>
-              <w:rPr>
-                <w:noProof/>
-                <w:webHidden/>
-              </w:rPr>
               <w:fldChar w:fldCharType="begin"/>
-            </w:r>
-            <w:r>
-              <w:rPr>
-                <w:noProof/>
-                <w:webHidden/>
-              </w:rPr>
               <w:instrText xml:space="preserve"> PAGEREF _Toc159784666 \h </w:instrText>
-            </w:r>
-            <w:r>
-              <w:rPr>
-                <w:noProof/>
-                <w:webHidden/>
-              </w:rPr>
-            </w:r>
-            <w:r>
-              <w:rPr>
-                <w:noProof/>
-                <w:webHidden/>
-              </w:rPr>
               <w:fldChar w:fldCharType="separate"/>
-            </w:r>
-            <w:r>
-              <w:rPr>
-                <w:noProof/>
-                <w:webHidden/>
-              </w:rPr>
               <w:t>10</w:t>
-            </w:r>
-            <w:r>
-              <w:rPr>
-                <w:noProof/>
-                <w:webHidden/>
-              </w:rPr>
               <w:fldChar w:fldCharType="end"/>
             </w:r>
           </w:hyperlink>
@@ -1617,46 +1085,10 @@
                 <w:webHidden/>
               </w:rPr>
               <w:tab/>
-            </w:r>
-            <w:r>
-              <w:rPr>
-                <w:noProof/>
-                <w:webHidden/>
-              </w:rPr>
               <w:fldChar w:fldCharType="begin"/>
-            </w:r>
-            <w:r>
-              <w:rPr>
-                <w:noProof/>
-                <w:webHidden/>
-              </w:rPr>
               <w:instrText xml:space="preserve"> PAGEREF _Toc159784667 \h </w:instrText>
-            </w:r>
-            <w:r>
-              <w:rPr>
-                <w:noProof/>
-                <w:webHidden/>
-              </w:rPr>
-            </w:r>
-            <w:r>
-              <w:rPr>
-                <w:noProof/>
-                <w:webHidden/>
-              </w:rPr>
               <w:fldChar w:fldCharType="separate"/>
-            </w:r>
-            <w:r>
-              <w:rPr>
-                <w:noProof/>
-                <w:webHidden/>
-              </w:rPr>
               <w:t>10</w:t>
-            </w:r>
-            <w:r>
-              <w:rPr>
-                <w:noProof/>
-                <w:webHidden/>
-              </w:rPr>
               <w:fldChar w:fldCharType="end"/>
             </w:r>
           </w:hyperlink>
@@ -1685,13 +1117,7 @@
       <w:bookmarkStart w:id="0" w:name="_Toc159784653"/>
       <w:r>
         <w:lastRenderedPageBreak/>
-        <w:t xml:space="preserve">1. </w:t>
-      </w:r>
-      <w:r>
-        <w:t xml:space="preserve">Business </w:t>
-      </w:r>
-      <w:r>
-        <w:t>Understanding</w:t>
+        <w:t xml:space="preserve">1. Business Understanding</w:t>
       </w:r>
       <w:bookmarkEnd w:id="0"/>
     </w:p>
@@ -1840,25 +1266,7 @@
           <w:lang w:eastAsia="en-GB"/>
           <w14:ligatures w14:val="none"/>
         </w:rPr>
-        <w:t xml:space="preserve">Collaboration between the software engineer and manufacturing engineer develops cross-functional synergy, assuring alignment with business objectives and operational reality. The team is poised to drive innovation and provide disruptive solutions that change predictive maintenance </w:t>
-      </w:r>
-      <w:r>
-        <w:rPr>
-          <w:rFonts w:eastAsia="Times New Roman"/>
-          <w:kern w:val="0"/>
-          <w:lang w:eastAsia="en-GB"/>
-          <w14:ligatures w14:val="none"/>
-        </w:rPr>
-        <w:t>standards</w:t>
-      </w:r>
-      <w:r>
-        <w:rPr>
-          <w:rFonts w:eastAsia="Times New Roman"/>
-          <w:kern w:val="0"/>
-          <w:lang w:eastAsia="en-GB"/>
-          <w14:ligatures w14:val="none"/>
-        </w:rPr>
-        <w:t xml:space="preserve"> within the manufacturing sector. </w:t>
+        <w:t xml:space="preserve">Collaboration between the software engineer and manufacturing engineer develops cross-functional synergy, assuring alignment with business objectives and operational reality. The team is poised to drive innovation and provide disruptive solutions that change predictive maintenance standards within the manufacturing sector. </w:t>
       </w:r>
     </w:p>
     <w:p>
@@ -1912,16 +1320,7 @@
           <w:lang w:eastAsia="en-GB"/>
           <w14:ligatures w14:val="none"/>
         </w:rPr>
-        <w:t xml:space="preserve">Predictive Modelling: </w:t>
-      </w:r>
-      <w:r>
-        <w:rPr>
-          <w:rFonts w:eastAsia="Times New Roman"/>
-          <w:kern w:val="0"/>
-          <w:lang w:eastAsia="en-GB"/>
-          <w14:ligatures w14:val="none"/>
-        </w:rPr>
-        <w:t>The team aims to create strong predictive analytics models that can accurately differentiate between machine failure occurrences (fail = TRUE) and normal operating situations (fail = FALSE). The team tries to understand the complex connections between machine operational parameters and failure outcomes using synthetic training data and real-world observations.</w:t>
+        <w:t xml:space="preserve">Predictive Modelling: The team aims to create strong predictive analytics models that can accurately differentiate between machine failure occurrences (fail = TRUE) and normal operating situations (fail = FALSE). The team tries to understand the complex connections between machine operational parameters and failure outcomes using synthetic training data and real-world observations.</w:t>
       </w:r>
     </w:p>
     <w:p>
@@ -1958,16 +1357,7 @@
           <w:lang w:eastAsia="en-GB"/>
           <w14:ligatures w14:val="none"/>
         </w:rPr>
-        <w:t xml:space="preserve">Business Viability: </w:t>
-      </w:r>
-      <w:r>
-        <w:rPr>
-          <w:rFonts w:eastAsia="Times New Roman"/>
-          <w:kern w:val="0"/>
-          <w:lang w:eastAsia="en-GB"/>
-          <w14:ligatures w14:val="none"/>
-        </w:rPr>
-        <w:t>The successful modelling of machine failures is a tempting economic prospect due to the machinery's importance in many production processes. The team sees their predictive maintenance solutions as a key element of operational efficiency and cost-effectiveness, leading to significant returns on investment for industry stakeholders.</w:t>
+        <w:t xml:space="preserve">Business Viability: The successful modelling of machine failures is a tempting economic prospect due to the machinery's importance in many production processes. The team sees their predictive maintenance solutions as a key element of operational efficiency and cost-effectiveness, leading to significant returns on investment for industry stakeholders.</w:t>
       </w:r>
     </w:p>
     <w:p>
@@ -2072,18 +1462,7 @@
           <w:lang w:eastAsia="en-GB"/>
           <w14:ligatures w14:val="none"/>
         </w:rPr>
-        <w:t>Workforce</w:t>
-      </w:r>
-      <w:r>
-        <w:rPr>
-          <w:rFonts w:eastAsia="Times New Roman"/>
-          <w:b/>
-          <w:bCs/>
-          <w:kern w:val="0"/>
-          <w:lang w:eastAsia="en-GB"/>
-          <w14:ligatures w14:val="none"/>
-        </w:rPr>
-        <w:t>:</w:t>
+        <w:t>Workforce:</w:t>
       </w:r>
       <w:r>
         <w:rPr>
@@ -2233,34 +1612,7 @@
           <w:lang w:eastAsia="en-GB"/>
           <w14:ligatures w14:val="none"/>
         </w:rPr>
-        <w:t xml:space="preserve">: Allocation of funding for project implementation, including staff charges, software licencing, </w:t>
-      </w:r>
-      <w:r>
-        <w:rPr>
-          <w:rFonts w:eastAsia="Times New Roman"/>
-          <w:kern w:val="0"/>
-          <w:lang w:eastAsia="en-GB"/>
-          <w14:ligatures w14:val="none"/>
-        </w:rPr>
-        <w:t xml:space="preserve">and </w:t>
-      </w:r>
-      <w:r>
-        <w:rPr>
-          <w:rFonts w:eastAsia="Times New Roman"/>
-          <w:kern w:val="0"/>
-          <w:lang w:eastAsia="en-GB"/>
-          <w14:ligatures w14:val="none"/>
-        </w:rPr>
-        <w:t>data collecting fees</w:t>
-      </w:r>
-      <w:r>
-        <w:rPr>
-          <w:rFonts w:eastAsia="Times New Roman"/>
-          <w:kern w:val="0"/>
-          <w:lang w:eastAsia="en-GB"/>
-          <w14:ligatures w14:val="none"/>
-        </w:rPr>
-        <w:t xml:space="preserve">. </w:t>
+        <w:t xml:space="preserve">: Allocation of funding for project implementation, including staff charges, software licencing, and data collecting fees. </w:t>
       </w:r>
     </w:p>
     <w:p>
@@ -2307,25 +1659,7 @@
           <w:lang w:eastAsia="en-GB"/>
           <w14:ligatures w14:val="none"/>
         </w:rPr>
-        <w:t>:</w:t>
-      </w:r>
-      <w:r>
-        <w:rPr>
-          <w:rFonts w:eastAsia="Times New Roman"/>
-          <w:kern w:val="0"/>
-          <w:lang w:eastAsia="en-GB"/>
-          <w14:ligatures w14:val="none"/>
-        </w:rPr>
-        <w:t xml:space="preserve"> </w:t>
-      </w:r>
-      <w:r>
-        <w:rPr>
-          <w:rFonts w:eastAsia="Times New Roman"/>
-          <w:kern w:val="0"/>
-          <w:lang w:eastAsia="en-GB"/>
-          <w14:ligatures w14:val="none"/>
-        </w:rPr>
-        <w:t>Potential collaboration with external specialists or research institutions for additional insights and knowledge.</w:t>
+        <w:t xml:space="preserve">: Potential collaboration with external specialists or research institutions for additional insights and knowledge.</w:t>
       </w:r>
     </w:p>
     <w:p>
@@ -2372,25 +1706,7 @@
           <w:lang w:eastAsia="en-GB"/>
           <w14:ligatures w14:val="none"/>
         </w:rPr>
-        <w:t>:</w:t>
-      </w:r>
-      <w:r>
-        <w:rPr>
-          <w:rFonts w:eastAsia="Times New Roman"/>
-          <w:kern w:val="0"/>
-          <w:lang w:eastAsia="en-GB"/>
-          <w14:ligatures w14:val="none"/>
-        </w:rPr>
-        <w:t xml:space="preserve"> </w:t>
-      </w:r>
-      <w:r>
-        <w:rPr>
-          <w:rFonts w:eastAsia="Times New Roman"/>
-          <w:kern w:val="0"/>
-          <w:lang w:eastAsia="en-GB"/>
-          <w14:ligatures w14:val="none"/>
-        </w:rPr>
-        <w:t>Access to data storage and management solutions for organizing and processing massive datasets.</w:t>
+        <w:t xml:space="preserve">: Access to data storage and management solutions for organizing and processing massive datasets.</w:t>
       </w:r>
     </w:p>
     <w:p>
@@ -2437,43 +1753,7 @@
           <w:lang w:eastAsia="en-GB"/>
           <w14:ligatures w14:val="none"/>
         </w:rPr>
-        <w:t>:</w:t>
-      </w:r>
-      <w:r>
-        <w:rPr>
-          <w:rFonts w:eastAsia="Times New Roman"/>
-          <w:kern w:val="0"/>
-          <w:lang w:eastAsia="en-GB"/>
-          <w14:ligatures w14:val="none"/>
-        </w:rPr>
-        <w:t xml:space="preserve"> </w:t>
-      </w:r>
-      <w:r>
-        <w:rPr>
-          <w:rFonts w:eastAsia="Times New Roman"/>
-          <w:kern w:val="0"/>
-          <w:lang w:eastAsia="en-GB"/>
-          <w14:ligatures w14:val="none"/>
-        </w:rPr>
-        <w:t>Opportunities for people training and skill development in data analytics and predictive model</w:t>
-      </w:r>
-      <w:r>
-        <w:rPr>
-          <w:rFonts w:eastAsia="Times New Roman"/>
-          <w:kern w:val="0"/>
-          <w:lang w:eastAsia="en-GB"/>
-          <w14:ligatures w14:val="none"/>
-        </w:rPr>
-        <w:t>l</w:t>
-      </w:r>
-      <w:r>
-        <w:rPr>
-          <w:rFonts w:eastAsia="Times New Roman"/>
-          <w:kern w:val="0"/>
-          <w:lang w:eastAsia="en-GB"/>
-          <w14:ligatures w14:val="none"/>
-        </w:rPr>
-        <w:t>ing methodologies.</w:t>
+        <w:t xml:space="preserve">: Opportunities for people training and skill development in data analytics and predictive modelling methodologies.</w:t>
       </w:r>
     </w:p>
     <w:p>
@@ -2520,25 +1800,7 @@
           <w:lang w:eastAsia="en-GB"/>
           <w14:ligatures w14:val="none"/>
         </w:rPr>
-        <w:t>:</w:t>
-      </w:r>
-      <w:r>
-        <w:rPr>
-          <w:rFonts w:eastAsia="Times New Roman"/>
-          <w:kern w:val="0"/>
-          <w:lang w:eastAsia="en-GB"/>
-          <w14:ligatures w14:val="none"/>
-        </w:rPr>
-        <w:t xml:space="preserve"> </w:t>
-      </w:r>
-      <w:r>
-        <w:rPr>
-          <w:rFonts w:eastAsia="Times New Roman"/>
-          <w:kern w:val="0"/>
-          <w:lang w:eastAsia="en-GB"/>
-          <w14:ligatures w14:val="none"/>
-        </w:rPr>
-        <w:t>Provision of project management resources to oversee project milestones, schedules, and deliverables.</w:t>
+        <w:t xml:space="preserve">: Provision of project management resources to oversee project milestones, schedules, and deliverables.</w:t>
       </w:r>
     </w:p>
     <w:p>
@@ -2561,43 +1823,7 @@
           <w14:ligatures w14:val="none"/>
         </w:rPr>
         <w:br/>
-        <w:t xml:space="preserve">By leveraging these resources effectively, the project team may create and execute comprehensive predictive analytics solutions to address machine failure concerns inside the manufacturing environment. Continuous </w:t>
-      </w:r>
-      <w:r>
-        <w:rPr>
-          <w:rFonts w:eastAsia="Times New Roman"/>
-          <w:kern w:val="0"/>
-          <w:lang w:eastAsia="en-GB"/>
-          <w14:ligatures w14:val="none"/>
-        </w:rPr>
-        <w:t>improvement</w:t>
-      </w:r>
-      <w:r>
-        <w:rPr>
-          <w:rFonts w:eastAsia="Times New Roman"/>
-          <w:kern w:val="0"/>
-          <w:lang w:eastAsia="en-GB"/>
-          <w14:ligatures w14:val="none"/>
-        </w:rPr>
-        <w:t xml:space="preserve"> and refining of resources will ensure the project's success in attaining its objectives and delivering tangible value to the </w:t>
-      </w:r>
-      <w:r>
-        <w:rPr>
-          <w:rFonts w:eastAsia="Times New Roman"/>
-          <w:kern w:val="0"/>
-          <w:lang w:eastAsia="en-GB"/>
-          <w14:ligatures w14:val="none"/>
-        </w:rPr>
-        <w:t>start-up</w:t>
-      </w:r>
-      <w:r>
-        <w:rPr>
-          <w:rFonts w:eastAsia="Times New Roman"/>
-          <w:kern w:val="0"/>
-          <w:lang w:eastAsia="en-GB"/>
-          <w14:ligatures w14:val="none"/>
-        </w:rPr>
-        <w:t>.</w:t>
+        <w:t xml:space="preserve">By leveraging these resources effectively, the project team may create and execute comprehensive predictive analytics solutions to address machine failure concerns inside the manufacturing environment. Continuous improvement and refining of resources will ensure the project's success in attaining its objectives and delivering tangible value to the start-up.</w:t>
       </w:r>
     </w:p>
     <w:p>
@@ -2682,25 +1908,7 @@
           <w:lang w:eastAsia="en-GB"/>
           <w14:ligatures w14:val="none"/>
         </w:rPr>
-        <w:t xml:space="preserve">Risk: Synthetic training data may not correctly reflect real-world settings, leading to model </w:t>
-      </w:r>
-      <w:r>
-        <w:rPr>
-          <w:rFonts w:eastAsia="Times New Roman"/>
-          <w:kern w:val="0"/>
-          <w:lang w:eastAsia="en-GB"/>
-          <w14:ligatures w14:val="none"/>
-        </w:rPr>
-        <w:t>inaccurate</w:t>
-      </w:r>
-      <w:r>
-        <w:rPr>
-          <w:rFonts w:eastAsia="Times New Roman"/>
-          <w:kern w:val="0"/>
-          <w:lang w:eastAsia="en-GB"/>
-          <w14:ligatures w14:val="none"/>
-        </w:rPr>
-        <w:t xml:space="preserve">. Contingency: Implement data validation techniques to identify abnormalities and discrepancies. Augment synthetic data with real-world observations for greater model generalization. </w:t>
+        <w:t xml:space="preserve">Risk: Synthetic training data may not correctly reflect real-world settings, leading to model inaccurate. Contingency: Implement data validation techniques to identify abnormalities and discrepancies. Augment synthetic data with real-world observations for greater model generalization. </w:t>
       </w:r>
     </w:p>
     <w:p>
@@ -2771,43 +1979,7 @@
           <w:lang w:eastAsia="en-GB"/>
           <w14:ligatures w14:val="none"/>
         </w:rPr>
-        <w:t>Contingency: Apply regulari</w:t>
-      </w:r>
-      <w:r>
-        <w:rPr>
-          <w:rFonts w:eastAsia="Times New Roman"/>
-          <w:kern w:val="0"/>
-          <w:lang w:eastAsia="en-GB"/>
-          <w14:ligatures w14:val="none"/>
-        </w:rPr>
-        <w:t>s</w:t>
-      </w:r>
-      <w:r>
-        <w:rPr>
-          <w:rFonts w:eastAsia="Times New Roman"/>
-          <w:kern w:val="0"/>
-          <w:lang w:eastAsia="en-GB"/>
-          <w14:ligatures w14:val="none"/>
-        </w:rPr>
-        <w:t>ation techniques and cross-validation approaches to prevent overfitting.</w:t>
-      </w:r>
-      <w:r>
-        <w:rPr>
-          <w:rFonts w:eastAsia="Times New Roman"/>
-          <w:kern w:val="0"/>
-          <w:lang w:eastAsia="en-GB"/>
-          <w14:ligatures w14:val="none"/>
-        </w:rPr>
-        <w:t xml:space="preserve"> </w:t>
-      </w:r>
-      <w:r>
-        <w:rPr>
-          <w:rFonts w:eastAsia="Times New Roman"/>
-          <w:kern w:val="0"/>
-          <w:lang w:eastAsia="en-GB"/>
-          <w14:ligatures w14:val="none"/>
-        </w:rPr>
-        <w:t xml:space="preserve">Evaluate model performance on validation datasets to ensure robustness. </w:t>
+        <w:t xml:space="preserve">Contingency: Apply regularisation techniques and cross-validation approaches to prevent overfitting. Evaluate model performance on validation datasets to ensure robustness. </w:t>
       </w:r>
     </w:p>
     <w:p>
@@ -3213,43 +2385,7 @@
           <w:lang w:eastAsia="en-GB"/>
           <w14:ligatures w14:val="none"/>
         </w:rPr>
-        <w:t>Risk:</w:t>
-      </w:r>
-      <w:r>
-        <w:rPr>
-          <w:rFonts w:eastAsia="Times New Roman"/>
-          <w:kern w:val="0"/>
-          <w:lang w:eastAsia="en-GB"/>
-          <w14:ligatures w14:val="none"/>
-        </w:rPr>
-        <w:t xml:space="preserve"> </w:t>
-      </w:r>
-      <w:r>
-        <w:rPr>
-          <w:rFonts w:eastAsia="Times New Roman"/>
-          <w:kern w:val="0"/>
-          <w:lang w:eastAsia="en-GB"/>
-          <w14:ligatures w14:val="none"/>
-        </w:rPr>
-        <w:t>Limited competence in data analytics and predictive model</w:t>
-      </w:r>
-      <w:r>
-        <w:rPr>
-          <w:rFonts w:eastAsia="Times New Roman"/>
-          <w:kern w:val="0"/>
-          <w:lang w:eastAsia="en-GB"/>
-          <w14:ligatures w14:val="none"/>
-        </w:rPr>
-        <w:t>l</w:t>
-      </w:r>
-      <w:r>
-        <w:rPr>
-          <w:rFonts w:eastAsia="Times New Roman"/>
-          <w:kern w:val="0"/>
-          <w:lang w:eastAsia="en-GB"/>
-          <w14:ligatures w14:val="none"/>
-        </w:rPr>
-        <w:t xml:space="preserve">ing may delay project progress. Contingency: Invest in training programs and external consultants to complement team skills. Foster a culture of knowledge sharing and collaboration to exploit varied skill sets efficiently. </w:t>
+        <w:t xml:space="preserve">Risk: Limited competence in data analytics and predictive modelling may delay project progress. Contingency: Invest in training programs and external consultants to complement team skills. Foster a culture of knowledge sharing and collaboration to exploit varied skill sets efficiently. </w:t>
       </w:r>
     </w:p>
     <w:p>
@@ -3281,25 +2417,7 @@
           <w:lang w:eastAsia="en-GB"/>
           <w14:ligatures w14:val="none"/>
         </w:rPr>
-        <w:t>By proactively identifying risks and executing contingency measures, the project team can prevent potential interruptions and boost the project's likelihood of success in delivering useful insights and solutions for predictive maintenance within manufacturin</w:t>
-      </w:r>
-      <w:r>
-        <w:rPr>
-          <w:rFonts w:eastAsia="Times New Roman"/>
-          <w:kern w:val="0"/>
-          <w:lang w:eastAsia="en-GB"/>
-          <w14:ligatures w14:val="none"/>
-        </w:rPr>
-        <w:t>g</w:t>
-      </w:r>
-      <w:r>
-        <w:rPr>
-          <w:rFonts w:eastAsia="Times New Roman"/>
-          <w:kern w:val="0"/>
-          <w:lang w:eastAsia="en-GB"/>
-          <w14:ligatures w14:val="none"/>
-        </w:rPr>
-        <w:t>.</w:t>
+        <w:t>By proactively identifying risks and executing contingency measures, the project team can prevent potential interruptions and boost the project's likelihood of success in delivering useful insights and solutions for predictive maintenance within manufacturing.</w:t>
       </w:r>
     </w:p>
     <w:p>
@@ -3640,19 +2758,7 @@
           <w:lang w:eastAsia="en-GB"/>
         </w:rPr>
         <w:lastRenderedPageBreak/>
-        <w:t>Tools for the Project</w:t>
-      </w:r>
-      <w:r>
-        <w:rPr>
-          <w:lang w:eastAsia="en-GB"/>
-        </w:rPr>
-        <w:t xml:space="preserve"> and </w:t>
-      </w:r>
-      <w:r>
-        <w:rPr>
-          <w:lang w:eastAsia="en-GB"/>
-        </w:rPr>
-        <w:t>Resources</w:t>
+        <w:t xml:space="preserve">Tools for the Project and Resources</w:t>
       </w:r>
       <w:bookmarkEnd w:id="7"/>
     </w:p>
@@ -3718,97 +2824,19 @@
           <w:lang w:eastAsia="en-GB"/>
         </w:rPr>
       </w:pPr>
-      <w:proofErr w:type="spellStart"/>
       <w:r>
         <w:rPr>
           <w:b/>
           <w:bCs/>
           <w:lang w:eastAsia="en-GB"/>
         </w:rPr>
-        <w:t>Tidyverse</w:t>
-      </w:r>
-      <w:proofErr w:type="spellEnd"/>
-      <w:r>
-        <w:rPr>
-          <w:b/>
-          <w:bCs/>
-          <w:lang w:eastAsia="en-GB"/>
-        </w:rPr>
-        <w:t xml:space="preserve"> Packages</w:t>
-      </w:r>
-      <w:r>
-        <w:rPr>
-          <w:lang w:eastAsia="en-GB"/>
-        </w:rPr>
-        <w:t xml:space="preserve">: Building upon </w:t>
-      </w:r>
-      <w:proofErr w:type="spellStart"/>
-      <w:r>
-        <w:rPr>
-          <w:lang w:eastAsia="en-GB"/>
-        </w:rPr>
-        <w:t>desctools</w:t>
-      </w:r>
-      <w:proofErr w:type="spellEnd"/>
-      <w:r>
-        <w:rPr>
-          <w:lang w:eastAsia="en-GB"/>
-        </w:rPr>
-        <w:t xml:space="preserve">, the </w:t>
-      </w:r>
-      <w:proofErr w:type="spellStart"/>
-      <w:r>
-        <w:rPr>
-          <w:lang w:eastAsia="en-GB"/>
-        </w:rPr>
-        <w:t>Tidyverse</w:t>
-      </w:r>
-      <w:proofErr w:type="spellEnd"/>
-      <w:r>
-        <w:rPr>
-          <w:lang w:eastAsia="en-GB"/>
-        </w:rPr>
-        <w:t xml:space="preserve"> suite (containing packages like </w:t>
-      </w:r>
-      <w:proofErr w:type="spellStart"/>
-      <w:r>
-        <w:rPr>
-          <w:lang w:eastAsia="en-GB"/>
-        </w:rPr>
-        <w:t>dplyr</w:t>
-      </w:r>
-      <w:proofErr w:type="spellEnd"/>
-      <w:r>
-        <w:rPr>
-          <w:lang w:eastAsia="en-GB"/>
-        </w:rPr>
-        <w:t xml:space="preserve"> and </w:t>
-      </w:r>
-      <w:proofErr w:type="spellStart"/>
-      <w:r>
-        <w:rPr>
-          <w:lang w:eastAsia="en-GB"/>
-        </w:rPr>
-        <w:t>tidyr</w:t>
-      </w:r>
-      <w:proofErr w:type="spellEnd"/>
-      <w:r>
-        <w:rPr>
-          <w:lang w:eastAsia="en-GB"/>
-        </w:rPr>
-        <w:t>) provides robust tools for data manipulation and transformation, ensuring data is prepared properly for model</w:t>
-      </w:r>
-      <w:r>
-        <w:rPr>
-          <w:lang w:eastAsia="en-GB"/>
-        </w:rPr>
-        <w:t>l</w:t>
-      </w:r>
-      <w:r>
-        <w:rPr>
-          <w:lang w:eastAsia="en-GB"/>
-        </w:rPr>
-        <w:t xml:space="preserve">ing. </w:t>
+        <w:t xml:space="preserve">Tidyverse Packages</w:t>
+      </w:r>
+      <w:r>
+        <w:rPr>
+          <w:lang w:eastAsia="en-GB"/>
+        </w:rPr>
+        <w:t xml:space="preserve">: Building upon desctools, the Tidyverse suite (containing packages like dplyr and tidyr) provides robust tools for data manipulation and transformation, ensuring data is prepared properly for modelling. </w:t>
       </w:r>
     </w:p>
     <w:p>
@@ -3860,55 +2888,7 @@
         <w:rPr>
           <w:lang w:eastAsia="en-GB"/>
         </w:rPr>
-        <w:t xml:space="preserve">ggplot2: </w:t>
-      </w:r>
-      <w:r>
-        <w:rPr>
-          <w:lang w:eastAsia="en-GB"/>
-        </w:rPr>
-        <w:t>D</w:t>
-      </w:r>
-      <w:r>
-        <w:rPr>
-          <w:lang w:eastAsia="en-GB"/>
-        </w:rPr>
-        <w:t xml:space="preserve">eveloping insightful and customisable visualizations, allowing </w:t>
-      </w:r>
-      <w:r>
-        <w:rPr>
-          <w:lang w:eastAsia="en-GB"/>
-        </w:rPr>
-        <w:t>for</w:t>
-      </w:r>
-      <w:r>
-        <w:rPr>
-          <w:lang w:eastAsia="en-GB"/>
-        </w:rPr>
-        <w:t xml:space="preserve"> analys</w:t>
-      </w:r>
-      <w:r>
-        <w:rPr>
-          <w:lang w:eastAsia="en-GB"/>
-        </w:rPr>
-        <w:t>is</w:t>
-      </w:r>
-      <w:r>
-        <w:rPr>
-          <w:lang w:eastAsia="en-GB"/>
-        </w:rPr>
-        <w:t xml:space="preserve"> </w:t>
-      </w:r>
-      <w:r>
-        <w:rPr>
-          <w:lang w:eastAsia="en-GB"/>
-        </w:rPr>
-        <w:t xml:space="preserve">of </w:t>
-      </w:r>
-      <w:r>
-        <w:rPr>
-          <w:lang w:eastAsia="en-GB"/>
-        </w:rPr>
-        <w:t xml:space="preserve">correlations between machine operational parameters and failure consequences. </w:t>
+        <w:t xml:space="preserve">ggplot2: Developing insightful and customisable visualizations, allowing for analysis of correlations between machine operational parameters and failure consequences. </w:t>
       </w:r>
     </w:p>
     <w:p>
@@ -3919,19 +2899,11 @@
           <w:lang w:eastAsia="en-GB"/>
         </w:rPr>
       </w:pPr>
-      <w:proofErr w:type="spellStart"/>
-      <w:r>
-        <w:rPr>
-          <w:lang w:eastAsia="en-GB"/>
-        </w:rPr>
-        <w:t>plotly</w:t>
-      </w:r>
-      <w:proofErr w:type="spellEnd"/>
-      <w:r>
-        <w:rPr>
-          <w:lang w:eastAsia="en-GB"/>
-        </w:rPr>
-        <w:t xml:space="preserve">: Offers interactive plots and dashboards, enabling the presentation and exploration of complicated data patterns. </w:t>
+      <w:r>
+        <w:rPr>
+          <w:lang w:eastAsia="en-GB"/>
+        </w:rPr>
+        <w:t xml:space="preserve">plotly: Offers interactive plots and dashboards, enabling the presentation and exploration of complicated data patterns. </w:t>
       </w:r>
     </w:p>
     <w:p>
@@ -3977,19 +2949,11 @@
           <w:lang w:eastAsia="en-GB"/>
         </w:rPr>
       </w:pPr>
-      <w:proofErr w:type="spellStart"/>
-      <w:r>
-        <w:rPr>
-          <w:lang w:eastAsia="en-GB"/>
-        </w:rPr>
-        <w:t>randomForest</w:t>
-      </w:r>
-      <w:proofErr w:type="spellEnd"/>
-      <w:r>
-        <w:rPr>
-          <w:lang w:eastAsia="en-GB"/>
-        </w:rPr>
-        <w:t xml:space="preserve">: Effective for generating ensemble learning models, for forecasting machine faults. </w:t>
+      <w:r>
+        <w:rPr>
+          <w:lang w:eastAsia="en-GB"/>
+        </w:rPr>
+        <w:t xml:space="preserve">randomForest: Effective for generating ensemble learning models, for forecasting machine faults. </w:t>
       </w:r>
     </w:p>
     <w:p>
@@ -4000,19 +2964,11 @@
           <w:lang w:eastAsia="en-GB"/>
         </w:rPr>
       </w:pPr>
-      <w:proofErr w:type="spellStart"/>
-      <w:r>
-        <w:rPr>
-          <w:lang w:eastAsia="en-GB"/>
-        </w:rPr>
-        <w:t>glmnet</w:t>
-      </w:r>
-      <w:proofErr w:type="spellEnd"/>
-      <w:r>
-        <w:rPr>
-          <w:lang w:eastAsia="en-GB"/>
-        </w:rPr>
-        <w:t xml:space="preserve">: Provides tools for fitting generalized linear models with Lasso or Elastic-Net regularization, suited for handling high-dimensional data and feature selection. </w:t>
+      <w:r>
+        <w:rPr>
+          <w:lang w:eastAsia="en-GB"/>
+        </w:rPr>
+        <w:t xml:space="preserve">glmnet: Provides tools for fitting generalized linear models with Lasso or Elastic-Net regularization, suited for handling high-dimensional data and feature selection. </w:t>
       </w:r>
     </w:p>
     <w:p>
@@ -4114,13 +3070,7 @@
         <w:rPr>
           <w:lang w:eastAsia="en-GB"/>
         </w:rPr>
-        <w:t>: Consider employing cloud computing platforms like Amazon Web Services (AWS) for scalable computing resources and storage capabilities</w:t>
-      </w:r>
-      <w:r>
-        <w:rPr>
-          <w:lang w:eastAsia="en-GB"/>
-        </w:rPr>
-        <w:t>.</w:t>
+        <w:t>: Consider employing cloud computing platforms like Amazon Web Services (AWS) for scalable computing resources and storage capabilities.</w:t>
       </w:r>
     </w:p>
     <w:p>
@@ -4156,19 +3106,7 @@
         <w:rPr>
           <w:lang w:eastAsia="en-GB"/>
         </w:rPr>
-        <w:t>: git integrated with RStudio</w:t>
-      </w:r>
-      <w:r>
-        <w:rPr>
-          <w:lang w:eastAsia="en-GB"/>
-        </w:rPr>
-        <w:t xml:space="preserve"> e</w:t>
-      </w:r>
-      <w:r>
-        <w:rPr>
-          <w:lang w:eastAsia="en-GB"/>
-        </w:rPr>
-        <w:t xml:space="preserve">nables version control and collaborative development, allowing team members to track changes, manage project iterations, and coordinate work effectively. </w:t>
+        <w:t xml:space="preserve">: git integrated with RStudio enables version control and collaborative development, allowing team members to track changes, manage project iterations, and coordinate work effectively. </w:t>
       </w:r>
     </w:p>
     <w:p>
@@ -4214,19 +3152,11 @@
           <w:lang w:eastAsia="en-GB"/>
         </w:rPr>
       </w:pPr>
-      <w:proofErr w:type="spellStart"/>
-      <w:r>
-        <w:rPr>
-          <w:lang w:eastAsia="en-GB"/>
-        </w:rPr>
-        <w:t>rmarkdown</w:t>
-      </w:r>
-      <w:proofErr w:type="spellEnd"/>
-      <w:r>
-        <w:rPr>
-          <w:lang w:eastAsia="en-GB"/>
-        </w:rPr>
-        <w:t xml:space="preserve">: Provides a versatile framework for building reproducible reports and presentations, integrating R code, graphics, and narrative prose seamlessly. </w:t>
+      <w:r>
+        <w:rPr>
+          <w:lang w:eastAsia="en-GB"/>
+        </w:rPr>
+        <w:t xml:space="preserve">rmarkdown: Provides a versatile framework for building reproducible reports and presentations, integrating R code, graphics, and narrative prose seamlessly. </w:t>
       </w:r>
     </w:p>
     <w:p>
@@ -4237,33 +3167,11 @@
           <w:lang w:eastAsia="en-GB"/>
         </w:rPr>
       </w:pPr>
-      <w:proofErr w:type="spellStart"/>
-      <w:r>
-        <w:rPr>
-          <w:lang w:eastAsia="en-GB"/>
-        </w:rPr>
-        <w:t>knitr</w:t>
-      </w:r>
-      <w:proofErr w:type="spellEnd"/>
-      <w:r>
-        <w:rPr>
-          <w:lang w:eastAsia="en-GB"/>
-        </w:rPr>
-        <w:t xml:space="preserve">: Works with </w:t>
-      </w:r>
-      <w:proofErr w:type="spellStart"/>
-      <w:r>
-        <w:rPr>
-          <w:lang w:eastAsia="en-GB"/>
-        </w:rPr>
-        <w:t>rmarkdown</w:t>
-      </w:r>
-      <w:proofErr w:type="spellEnd"/>
-      <w:r>
-        <w:rPr>
-          <w:lang w:eastAsia="en-GB"/>
-        </w:rPr>
-        <w:t xml:space="preserve"> to provide dynamic and interactive reports, boosting the communication of project findings and insights.</w:t>
+      <w:r>
+        <w:rPr>
+          <w:lang w:eastAsia="en-GB"/>
+        </w:rPr>
+        <w:t xml:space="preserve">knitr: Works with rmarkdown to provide dynamic and interactive reports, boosting the communication of project findings and insights.</w:t>
       </w:r>
     </w:p>
     <w:p>
@@ -4272,13 +3180,7 @@
       </w:pPr>
       <w:bookmarkStart w:id="8" w:name="_Toc159784661"/>
       <w:r>
-        <w:t>2. Data</w:t>
-      </w:r>
-      <w:r>
-        <w:t xml:space="preserve"> </w:t>
-      </w:r>
-      <w:r>
-        <w:t>Understanding</w:t>
+        <w:t xml:space="preserve">2. Data Understanding</w:t>
       </w:r>
       <w:bookmarkEnd w:id="8"/>
     </w:p>
@@ -4297,10 +3199,7 @@
       </w:pPr>
       <w:bookmarkStart w:id="9" w:name="_Toc159784662"/>
       <w:r>
-        <w:t>Data Format</w:t>
-      </w:r>
-      <w:r>
-        <w:t xml:space="preserve"> and Data Quantity</w:t>
+        <w:t xml:space="preserve">Data Format and Data Quantity</w:t>
       </w:r>
       <w:bookmarkEnd w:id="9"/>
     </w:p>
@@ -4337,25 +3236,7 @@
           <w:lang w:eastAsia="en-GB"/>
           <w14:ligatures w14:val="none"/>
         </w:rPr>
-        <w:t xml:space="preserve">: </w:t>
-      </w:r>
-      <w:r>
-        <w:rPr>
-          <w:rFonts w:eastAsia="Times New Roman"/>
-          <w:kern w:val="0"/>
-          <w:lang w:eastAsia="en-GB"/>
-          <w14:ligatures w14:val="none"/>
-        </w:rPr>
-        <w:t xml:space="preserve">str(data) = </w:t>
-      </w:r>
-      <w:r>
-        <w:rPr>
-          <w:rFonts w:eastAsia="Times New Roman"/>
-          <w:kern w:val="0"/>
-          <w:lang w:eastAsia="en-GB"/>
-          <w14:ligatures w14:val="none"/>
-        </w:rPr>
-        <w:t xml:space="preserve">The dataset is a data frame consisting of 10,000 observations (rows) and 6 variables (columns). </w:t>
+        <w:t xml:space="preserve">: str(data) = The dataset is a data frame consisting of 10,000 observations (rows) and 6 variables (columns). </w:t>
       </w:r>
     </w:p>
     <w:p>
@@ -4394,29 +3275,7 @@
           <w:lang w:eastAsia="en-GB"/>
           <w14:ligatures w14:val="none"/>
         </w:rPr>
-        <w:t xml:space="preserve">Variable </w:t>
-      </w:r>
-      <w:r>
-        <w:rPr>
-          <w:rFonts w:eastAsia="Times New Roman"/>
-          <w:b/>
-          <w:bCs/>
-          <w:kern w:val="0"/>
-          <w:lang w:eastAsia="en-GB"/>
-          <w14:ligatures w14:val="none"/>
-        </w:rPr>
-        <w:t xml:space="preserve">Data </w:t>
-      </w:r>
-      <w:r>
-        <w:rPr>
-          <w:rFonts w:eastAsia="Times New Roman"/>
-          <w:b/>
-          <w:bCs/>
-          <w:kern w:val="0"/>
-          <w:lang w:eastAsia="en-GB"/>
-          <w14:ligatures w14:val="none"/>
-        </w:rPr>
-        <w:t>Types</w:t>
+        <w:t xml:space="preserve">Variable Data Types</w:t>
       </w:r>
       <w:r>
         <w:rPr>
@@ -4450,25 +3309,7 @@
           <w:lang w:eastAsia="en-GB"/>
           <w14:ligatures w14:val="none"/>
         </w:rPr>
-        <w:t>Air_temperature_.K., Process_temperature_.K., and Torque_.Nm. are</w:t>
-      </w:r>
-      <w:r>
-        <w:rPr>
-          <w:rFonts w:eastAsia="Times New Roman"/>
-          <w:kern w:val="0"/>
-          <w:lang w:eastAsia="en-GB"/>
-          <w14:ligatures w14:val="none"/>
-        </w:rPr>
-        <w:t xml:space="preserve"> </w:t>
-      </w:r>
-      <w:r>
-        <w:rPr>
-          <w:rFonts w:eastAsia="Times New Roman"/>
-          <w:kern w:val="0"/>
-          <w:lang w:eastAsia="en-GB"/>
-          <w14:ligatures w14:val="none"/>
-        </w:rPr>
-        <w:t>numeric variables.</w:t>
+        <w:t xml:space="preserve">Air_temperature_.K., Process_temperature_.K., and Torque_.Nm. are numeric variables.</w:t>
       </w:r>
     </w:p>
     <w:p>
@@ -4707,7 +3548,7 @@
         <w:rPr>
           <w:lang w:eastAsia="en-GB"/>
         </w:rPr>
-        <w:t xml:space="preserve">: No missing values are obvious in the output, as shown by the absence of any 'NA' values in the data frame's structure. </w:t>
+        <w:t xml:space="preserve">: No values are missing: colSums(is.na(data)) returns 0 for every variable, and summary(data) and Desc(data) report no NA values. </w:t>
       </w:r>
     </w:p>
     <w:p>
@@ -4743,43 +3584,7 @@
         <w:rPr>
           <w:lang w:eastAsia="en-GB"/>
         </w:rPr>
-        <w:t xml:space="preserve">: </w:t>
-      </w:r>
-      <w:r>
-        <w:rPr>
-          <w:lang w:eastAsia="en-GB"/>
-        </w:rPr>
-        <w:t>Th</w:t>
-      </w:r>
-      <w:r>
-        <w:rPr>
-          <w:lang w:eastAsia="en-GB"/>
-        </w:rPr>
-        <w:t xml:space="preserve">e dataset's quantity of 10,000 </w:t>
-      </w:r>
-      <w:r>
-        <w:rPr>
-          <w:lang w:eastAsia="en-GB"/>
-        </w:rPr>
-        <w:t>rows and 6 columns</w:t>
-      </w:r>
-      <w:r>
-        <w:rPr>
-          <w:lang w:eastAsia="en-GB"/>
-        </w:rPr>
-        <w:t xml:space="preserve"> provides a solid foundation for conducting comprehensive data analysis and model</w:t>
-      </w:r>
-      <w:r>
-        <w:rPr>
-          <w:lang w:eastAsia="en-GB"/>
-        </w:rPr>
-        <w:t>l</w:t>
-      </w:r>
-      <w:r>
-        <w:rPr>
-          <w:lang w:eastAsia="en-GB"/>
-        </w:rPr>
-        <w:t>ing efforts aimed at understanding and predicting machine failure events within the manufacturing environment.</w:t>
+        <w:t xml:space="preserve">: The dataset's quantity of 10,000 rows and 6 columns provides a solid foundation for conducting comprehensive data analysis and modelling efforts aimed at understanding and predicting machine failure events within the manufacturing environment.</w:t>
       </w:r>
     </w:p>
     <w:p>
@@ -4816,67 +3621,7 @@
         <w:rPr>
           <w:lang w:eastAsia="en-GB"/>
         </w:rPr>
-        <w:t xml:space="preserve"> for predicting machine </w:t>
-      </w:r>
-      <w:r>
-        <w:rPr>
-          <w:lang w:eastAsia="en-GB"/>
-        </w:rPr>
-        <w:t>failures</w:t>
-      </w:r>
-      <w:r>
-        <w:rPr>
-          <w:lang w:eastAsia="en-GB"/>
-        </w:rPr>
-        <w:t xml:space="preserve"> based on operational conditions. With 10,000 observations, it delivers sufficient data volume for model</w:t>
-      </w:r>
-      <w:r>
-        <w:rPr>
-          <w:lang w:eastAsia="en-GB"/>
-        </w:rPr>
-        <w:t>l</w:t>
-      </w:r>
-      <w:r>
-        <w:rPr>
-          <w:lang w:eastAsia="en-GB"/>
-        </w:rPr>
-        <w:t xml:space="preserve">ing. Variables like as temperature, speed, torque, and tool wear provide significant insights into potential failure modes. The inclusion of the </w:t>
-      </w:r>
-      <w:r>
-        <w:rPr>
-          <w:lang w:eastAsia="en-GB"/>
-        </w:rPr>
-        <w:t>“</w:t>
-      </w:r>
-      <w:r>
-        <w:rPr>
-          <w:lang w:eastAsia="en-GB"/>
-        </w:rPr>
-        <w:t>Machine_failure</w:t>
-      </w:r>
-      <w:r>
-        <w:rPr>
-          <w:lang w:eastAsia="en-GB"/>
-        </w:rPr>
-        <w:t>”</w:t>
-      </w:r>
-      <w:r>
-        <w:rPr>
-          <w:lang w:eastAsia="en-GB"/>
-        </w:rPr>
-        <w:t xml:space="preserve"> variable enables the </w:t>
-      </w:r>
-      <w:r>
-        <w:rPr>
-          <w:lang w:eastAsia="en-GB"/>
-        </w:rPr>
-        <w:t>replication</w:t>
-      </w:r>
-      <w:r>
-        <w:rPr>
-          <w:lang w:eastAsia="en-GB"/>
-        </w:rPr>
-        <w:t xml:space="preserve"> of failure events. However, further examination of data quality and pre-processing is necessary to ensure reliability. Overall, the dataset is a great resource for building predictive maintenance solutions to boost operational efficiency and minimize downtime in manufacturing operations. </w:t>
+        <w:t xml:space="preserve"> for predicting machine failures based on operational conditions. With 10,000 observations, it delivers sufficient data volume for modelling. Variables like as temperature, speed, torque, and tool wear provide significant insights into potential failure modes. The inclusion of the “Machine_failure” variable enables the replication of failure events. However, further examination of data quality and pre-processing is necessary to ensure reliability. Overall, the dataset is a great resource for building predictive maintenance solutions to boost operational efficiency and minimize downtime in manufacturing operations. </w:t>
       </w:r>
     </w:p>
     <w:p>
@@ -4973,23 +3718,7 @@
           <w14:ligatures w14:val="none"/>
         </w:rPr>
         <w:t>:</w:t>
-      </w:r>
-      <w:r>
-        <w:rPr>
-          <w:rFonts w:eastAsia="Times New Roman"/>
-          <w:kern w:val="0"/>
-          <w:lang w:eastAsia="en-GB"/>
-          <w14:ligatures w14:val="none"/>
-        </w:rPr>
         <w:br/>
-      </w:r>
-      <w:r>
-        <w:rPr>
-          <w:rFonts w:eastAsia="Times New Roman"/>
-          <w:kern w:val="0"/>
-          <w:lang w:eastAsia="en-GB"/>
-          <w14:ligatures w14:val="none"/>
-        </w:rPr>
         <w:t>For variables like Air_temperature_.K., Process_temperature_.K., Rotational_speed_.rpm., and Torque_.Nm., we see a broad range of values from the minimum to the maximum, showing variability in the measurements across different observations.</w:t>
       </w:r>
     </w:p>
@@ -5011,7 +3740,7 @@
           <w:lang w:eastAsia="en-GB"/>
           <w14:ligatures w14:val="none"/>
         </w:rPr>
-        <w:t>Air_temperature_.K. and Process_temperature_.K. range from about 295.3 to 304.5 Kelvin, while Rotational_speed_.rpm. ranges from 1168 to 2915 RPM, and Torque_.Nm. ranges from 3.20 to 76.60 Newton meters.</w:t>
+        <w:t>Air_temperature_.K. ranges from about 295.3 to 304.5 Kelvin and Process_temperature_.K. from about 304.3 to 322.6 Kelvin, while Rotational_speed_.rpm. ranges from 1168 to 2915 RPM, and Torque_.Nm. ranges from 3.20 to 76.60 Newton meters.</w:t>
       </w:r>
     </w:p>
     <w:p>
@@ -5052,24 +3781,8 @@
           <w14:ligatures w14:val="none"/>
         </w:rPr>
         <w:t>:</w:t>
-      </w:r>
-      <w:r>
-        <w:rPr>
-          <w:rFonts w:eastAsia="Times New Roman"/>
-          <w:kern w:val="0"/>
-          <w:lang w:eastAsia="en-GB"/>
-          <w14:ligatures w14:val="none"/>
-        </w:rPr>
         <w:br/>
-        <w:t>The mean values for Air_temperature_.K., Process_temperature_.K., Rotational_speed_.rpm., and Torque_.Nm. are generally close to the median values, indicating symmetric distributions with modest skewness.</w:t>
-      </w:r>
-      <w:r>
-        <w:rPr>
-          <w:rFonts w:eastAsia="Times New Roman"/>
-          <w:kern w:val="0"/>
-          <w:lang w:eastAsia="en-GB"/>
-          <w14:ligatures w14:val="none"/>
-        </w:rPr>
+        <w:t>For Air_temperature_.K., Process_temperature_.K. and Torque_.Nm. the mean is close to the median, indicating roughly symmetric distributions. Rotational_speed_.rpm. is right-skewed (mean 1539 and median 1503 rpm, maximum 2915 rpm, skewness about 2.0): a tail of high-speed observations (418 rows fall outside the 1.5 x IQR limits) pulls the mean above the median. Tool_wear_.min. is spread fairly evenly between 0 and 253 minutes.</w:t>
         <w:br/>
         <w:t>The mean values for these variables provide an approximation of the central tendency or average value of the measurements.</w:t>
       </w:r>
@@ -5112,60 +3825,8 @@
           <w14:ligatures w14:val="none"/>
         </w:rPr>
         <w:t>:</w:t>
-      </w:r>
-      <w:r>
-        <w:rPr>
-          <w:rFonts w:eastAsia="Times New Roman"/>
-          <w:kern w:val="0"/>
-          <w:lang w:eastAsia="en-GB"/>
-          <w14:ligatures w14:val="none"/>
-        </w:rPr>
         <w:br/>
-        <w:t xml:space="preserve">The Tool_wear_.min. variable spans from 0 to 253 minutes, with </w:t>
-      </w:r>
-      <w:r>
-        <w:rPr>
-          <w:rFonts w:eastAsia="Times New Roman"/>
-          <w:kern w:val="0"/>
-          <w:lang w:eastAsia="en-GB"/>
-          <w14:ligatures w14:val="none"/>
-        </w:rPr>
-        <w:t>a</w:t>
-      </w:r>
-      <w:r>
-        <w:rPr>
-          <w:rFonts w:eastAsia="Times New Roman"/>
-          <w:kern w:val="0"/>
-          <w:lang w:eastAsia="en-GB"/>
-          <w14:ligatures w14:val="none"/>
-        </w:rPr>
-        <w:t xml:space="preserve"> median value </w:t>
-      </w:r>
-      <w:r>
-        <w:rPr>
-          <w:rFonts w:eastAsia="Times New Roman"/>
-          <w:kern w:val="0"/>
-          <w:lang w:eastAsia="en-GB"/>
-          <w14:ligatures w14:val="none"/>
-        </w:rPr>
-        <w:t xml:space="preserve">of </w:t>
-      </w:r>
-      <w:r>
-        <w:rPr>
-          <w:rFonts w:eastAsia="Times New Roman"/>
-          <w:kern w:val="0"/>
-          <w:lang w:eastAsia="en-GB"/>
-          <w14:ligatures w14:val="none"/>
-        </w:rPr>
-        <w:t>about 108 minutes.</w:t>
-      </w:r>
-      <w:r>
-        <w:rPr>
-          <w:rFonts w:eastAsia="Times New Roman"/>
-          <w:kern w:val="0"/>
-          <w:lang w:eastAsia="en-GB"/>
-          <w14:ligatures w14:val="none"/>
-        </w:rPr>
+        <w:t xml:space="preserve">The Tool_wear_.min. variable spans from 0 to 253 minutes, with a median value of about 108 minutes.</w:t>
         <w:br/>
         <w:t>This shows that the period of tool wear varies greatly among observations, with some instances of protracted tool usage.</w:t>
       </w:r>
@@ -5208,14 +3869,6 @@
           <w14:ligatures w14:val="none"/>
         </w:rPr>
         <w:t>:</w:t>
-      </w:r>
-      <w:r>
-        <w:rPr>
-          <w:rFonts w:eastAsia="Times New Roman"/>
-          <w:kern w:val="0"/>
-          <w:lang w:eastAsia="en-GB"/>
-          <w14:ligatures w14:val="none"/>
-        </w:rPr>
         <w:br/>
         <w:t>The Machine_failure variable is expressed by logical values (TRUE or FALSE), indicating if a machine failure occurred.</w:t>
       </w:r>
@@ -5238,7 +3891,7 @@
           <w:lang w:eastAsia="en-GB"/>
           <w14:ligatures w14:val="none"/>
         </w:rPr>
-        <w:t>The summary reveals that out of 10,000 data, 339 cases are recognised as machine failures (TRUE), whereas the majority (9661 observations) indicate regular operation (FALSE).</w:t>
+        <w:t>The summary reveals that out of 10,000 data, 339 cases are recognised as machine failures (TRUE), whereas the majority (9661 observations) indicate regular operation (FALSE). Only 3.4% of the rows are failures, so a model that always predicted "no failure" would be 96.6% accurate while detecting no failures at all. Accuracy alone is therefore not a suitable measure for this data; precision and recall on the failure class should be reported.</w:t>
       </w:r>
     </w:p>
     <w:p>
@@ -5269,29 +3922,7 @@
           <w:lang w:eastAsia="en-GB"/>
           <w14:ligatures w14:val="none"/>
         </w:rPr>
-        <w:t>Data</w:t>
-      </w:r>
-      <w:r>
-        <w:rPr>
-          <w:rFonts w:eastAsia="Times New Roman"/>
-          <w:b/>
-          <w:bCs/>
-          <w:kern w:val="0"/>
-          <w:lang w:eastAsia="en-GB"/>
-          <w14:ligatures w14:val="none"/>
-        </w:rPr>
-        <w:t xml:space="preserve"> </w:t>
-      </w:r>
-      <w:r>
-        <w:rPr>
-          <w:rFonts w:eastAsia="Times New Roman"/>
-          <w:b/>
-          <w:bCs/>
-          <w:kern w:val="0"/>
-          <w:lang w:eastAsia="en-GB"/>
-          <w14:ligatures w14:val="none"/>
-        </w:rPr>
-        <w:t>Distribution</w:t>
+        <w:t xml:space="preserve">Data Distribution</w:t>
       </w:r>
       <w:r>
         <w:rPr>
@@ -5301,14 +3932,6 @@
           <w14:ligatures w14:val="none"/>
         </w:rPr>
         <w:t>:</w:t>
-      </w:r>
-      <w:r>
-        <w:rPr>
-          <w:rFonts w:eastAsia="Times New Roman"/>
-          <w:kern w:val="0"/>
-          <w:lang w:eastAsia="en-GB"/>
-          <w14:ligatures w14:val="none"/>
-        </w:rPr>
         <w:br/>
         <w:t>The quartiles (1st, 2nd, and 3rd quartiles) provide insights into the distribution of values within each variable, helping to examine the dispersion and variability of the data.</w:t>
       </w:r>
@@ -5364,7 +3987,6 @@
           <w:lang w:eastAsia="en-GB"/>
         </w:rPr>
       </w:pPr>
-      <w:proofErr w:type="spellStart"/>
       <w:r>
         <w:rPr>
           <w:b/>
@@ -5372,16 +3994,7 @@
           <w:lang w:eastAsia="en-GB"/>
         </w:rPr>
         <w:lastRenderedPageBreak/>
-        <w:t>desc</w:t>
-      </w:r>
-      <w:proofErr w:type="spellEnd"/>
-      <w:r>
-        <w:rPr>
-          <w:b/>
-          <w:bCs/>
-          <w:lang w:eastAsia="en-GB"/>
-        </w:rPr>
-        <w:t>(data)</w:t>
+        <w:t>desc(data)</w:t>
       </w:r>
       <w:r>
         <w:rPr>
@@ -5411,67 +4024,7 @@
         <w:rPr>
           <w:lang w:eastAsia="en-GB"/>
         </w:rPr>
-        <w:t xml:space="preserve">The blue </w:t>
-      </w:r>
-      <w:r>
-        <w:rPr>
-          <w:lang w:eastAsia="en-GB"/>
-        </w:rPr>
-        <w:t>part</w:t>
-      </w:r>
-      <w:r>
-        <w:rPr>
-          <w:lang w:eastAsia="en-GB"/>
-        </w:rPr>
-        <w:t xml:space="preserve"> represents instances where machine failure is marked as FALSE, total</w:t>
-      </w:r>
-      <w:r>
-        <w:rPr>
-          <w:lang w:eastAsia="en-GB"/>
-        </w:rPr>
-        <w:t>l</w:t>
-      </w:r>
-      <w:r>
-        <w:rPr>
-          <w:lang w:eastAsia="en-GB"/>
-        </w:rPr>
-        <w:t>ing 9,661</w:t>
-      </w:r>
-      <w:r>
-        <w:rPr>
-          <w:lang w:eastAsia="en-GB"/>
-        </w:rPr>
-        <w:t xml:space="preserve"> </w:t>
-      </w:r>
-      <w:r>
-        <w:rPr>
-          <w:lang w:eastAsia="en-GB"/>
-        </w:rPr>
-        <w:t>observations, which accounts for 96.6% of the dataset.</w:t>
-      </w:r>
-      <w:r>
-        <w:rPr>
-          <w:lang w:eastAsia="en-GB"/>
-        </w:rPr>
-        <w:t xml:space="preserve"> </w:t>
-      </w:r>
-      <w:r>
-        <w:rPr>
-          <w:lang w:eastAsia="en-GB"/>
-        </w:rPr>
-        <w:t xml:space="preserve">The red </w:t>
-      </w:r>
-      <w:r>
-        <w:rPr>
-          <w:lang w:eastAsia="en-GB"/>
-        </w:rPr>
-        <w:t>part</w:t>
-      </w:r>
-      <w:r>
-        <w:rPr>
-          <w:lang w:eastAsia="en-GB"/>
-        </w:rPr>
-        <w:t xml:space="preserve"> denotes instances where machine failure is marked as TRUE, with a frequency of 339 observations, equivalent to 3.4% of the dataset.</w:t>
+        <w:t xml:space="preserve">The blue part represents instances where machine failure is marked as FALSE, totalling 9,661 observations, which accounts for 96.6% of the dataset. The red part denotes instances where machine failure is marked as TRUE, with a frequency of 339 observations, equivalent to 3.4% of the dataset.</w:t>
       </w:r>
     </w:p>
     <w:p>
@@ -5519,13 +4072,7 @@
         <w:rPr>
           <w:lang w:eastAsia="en-GB"/>
         </w:rPr>
-        <w:t>the range from 0.0 to 1.0 represents the counts of observations or instances within the dataset. This range indicates the proportion of occurrences of a particular category relative to the total number of observations</w:t>
-      </w:r>
-      <w:r>
-        <w:rPr>
-          <w:lang w:eastAsia="en-GB"/>
-        </w:rPr>
-        <w:t xml:space="preserve">. </w:t>
+        <w:t xml:space="preserve">The axis from 0.0 to 1.0 shows the proportion of observations in each category relative to the total number of observations (a proportion, not a count). </w:t>
       </w:r>
     </w:p>
     <w:p>
@@ -5572,19 +4119,7 @@
         <w:rPr>
           <w:lang w:eastAsia="en-GB"/>
         </w:rPr>
-        <w:t>The ok_operation_row_indices variable is created using the which(!data$Machine_failure) expression. This expression selects the indices of rows where the Machine_failure column is False (i.e., successful operations). The</w:t>
-      </w:r>
-      <w:r>
-        <w:rPr>
-          <w:lang w:eastAsia="en-GB"/>
-        </w:rPr>
-        <w:t xml:space="preserve"> </w:t>
-      </w:r>
-      <w:r>
-        <w:rPr>
-          <w:lang w:eastAsia="en-GB"/>
-        </w:rPr>
-        <w:t>! operator negates the condition, so it essentially selects rows where Machine_failure is False.</w:t>
+        <w:t xml:space="preserve">The ok_operation_row_indices variable is created using the which(!data$Machine_failure) expression. This expression selects the indices of rows where the Machine_failure column is False (i.e., successful operations). The ! operator negates the condition, so it essentially selects rows where Machine_failure is False.</w:t>
       </w:r>
     </w:p>
     <w:p>
@@ -5632,11 +4167,6 @@
           <w:lang w:eastAsia="en-GB"/>
         </w:rPr>
         <w:t>The fail_row_indices variable is created using the which(data$Machine_failure) expression. This expression selects the indices of rows where the Machine_failure column is True (i.e., failed operations).</w:t>
-      </w:r>
-      <w:r>
-        <w:rPr>
-          <w:lang w:eastAsia="en-GB"/>
-        </w:rPr>
         <w:br/>
       </w:r>
     </w:p>
@@ -5675,31 +4205,7 @@
         <w:rPr>
           <w:lang w:eastAsia="en-GB"/>
         </w:rPr>
-        <w:t xml:space="preserve">Ok Operation </w:t>
-      </w:r>
-      <w:r>
-        <w:rPr>
-          <w:lang w:eastAsia="en-GB"/>
-        </w:rPr>
-        <w:t>Indices</w:t>
-      </w:r>
-      <w:r>
-        <w:rPr>
-          <w:lang w:eastAsia="en-GB"/>
-        </w:rPr>
-        <w:t xml:space="preserve">: Rows when machine operation </w:t>
-      </w:r>
-      <w:r>
-        <w:rPr>
-          <w:lang w:eastAsia="en-GB"/>
-        </w:rPr>
-        <w:t>i</w:t>
-      </w:r>
-      <w:r>
-        <w:rPr>
-          <w:lang w:eastAsia="en-GB"/>
-        </w:rPr>
-        <w:t>s successful.</w:t>
+        <w:t xml:space="preserve">Ok Operation Indices: Rows when machine operation is successful.</w:t>
       </w:r>
     </w:p>
     <w:p>
@@ -5714,19 +4220,7 @@
         <w:rPr>
           <w:lang w:eastAsia="en-GB"/>
         </w:rPr>
-        <w:t xml:space="preserve">Failures </w:t>
-      </w:r>
-      <w:r>
-        <w:rPr>
-          <w:lang w:eastAsia="en-GB"/>
-        </w:rPr>
-        <w:t>Indices</w:t>
-      </w:r>
-      <w:r>
-        <w:rPr>
-          <w:lang w:eastAsia="en-GB"/>
-        </w:rPr>
-        <w:t xml:space="preserve">: Rows where machine failure occurred. </w:t>
+        <w:t xml:space="preserve">Failures Indices: Rows where machine failure occurred. </w:t>
       </w:r>
     </w:p>
     <w:p>
@@ -5750,25 +4244,7 @@
         <w:rPr>
           <w:lang w:eastAsia="en-GB"/>
         </w:rPr>
-        <w:t xml:space="preserve">Here </w:t>
-      </w:r>
-      <w:r>
-        <w:rPr>
-          <w:lang w:eastAsia="en-GB"/>
-        </w:rPr>
-        <w:t xml:space="preserve">are </w:t>
-      </w:r>
-      <w:r>
-        <w:rPr>
-          <w:lang w:eastAsia="en-GB"/>
-        </w:rPr>
-        <w:t>suggestions</w:t>
-      </w:r>
-      <w:r>
-        <w:rPr>
-          <w:lang w:eastAsia="en-GB"/>
-        </w:rPr>
-        <w:t xml:space="preserve">: </w:t>
+        <w:t xml:space="preserve">Here are suggestions: </w:t>
       </w:r>
     </w:p>
     <w:p>
@@ -5792,19 +4268,7 @@
         <w:rPr>
           <w:lang w:eastAsia="en-GB"/>
         </w:rPr>
-        <w:t xml:space="preserve">Comparing Variables: </w:t>
-      </w:r>
-      <w:r>
-        <w:rPr>
-          <w:lang w:eastAsia="en-GB"/>
-        </w:rPr>
-        <w:t>S</w:t>
-      </w:r>
-      <w:r>
-        <w:rPr>
-          <w:lang w:eastAsia="en-GB"/>
-        </w:rPr>
-        <w:t xml:space="preserve">tudy how variables such as temperature, speed, torque, and tool wear differ between cases of machine failure and successful operation. </w:t>
+        <w:t xml:space="preserve">Comparing Variables: Study how variables such as temperature, speed, torque, and tool wear differ between cases of machine failure and successful operation. </w:t>
       </w:r>
     </w:p>
     <w:p>
@@ -5834,13 +4298,7 @@
         <w:rPr>
           <w:lang w:eastAsia="en-GB"/>
         </w:rPr>
-        <w:t>P</w:t>
-      </w:r>
-      <w:r>
-        <w:rPr>
-          <w:lang w:eastAsia="en-GB"/>
-        </w:rPr>
-        <w:t xml:space="preserve">rediction Insights: Understanding these differences helps inform prediction algorithms. Variables with significant changes between failure and non-failure instances could be valuable indicators for future failure identification. </w:t>
+        <w:t xml:space="preserve">Prediction Insights: Understanding these differences helps inform prediction algorithms. Variables with significant changes between failure and non-failure instances could be valuable indicators for future failure identification. </w:t>
       </w:r>
     </w:p>
     <w:p>
@@ -5902,13 +4360,7 @@
         <w:rPr>
           <w:lang w:eastAsia="en-GB"/>
         </w:rPr>
-        <w:t xml:space="preserve">It allows us </w:t>
-      </w:r>
-      <w:r>
-        <w:rPr>
-          <w:lang w:eastAsia="en-GB"/>
-        </w:rPr>
-        <w:t>to analyse the characteristics and distributions of variables specifically for instances where the machine operation was successful.</w:t>
+        <w:t xml:space="preserve">It allows us to analyse the characteristics and distributions of variables specifically for instances where the machine operation was successful.</w:t>
       </w:r>
     </w:p>
     <w:p>
@@ -5955,25 +4407,7 @@
         <w:rPr>
           <w:lang w:eastAsia="en-GB"/>
         </w:rPr>
-        <w:t xml:space="preserve">It </w:t>
-      </w:r>
-      <w:r>
-        <w:rPr>
-          <w:lang w:eastAsia="en-GB"/>
-        </w:rPr>
-        <w:t xml:space="preserve">allows </w:t>
-      </w:r>
-      <w:r>
-        <w:rPr>
-          <w:lang w:eastAsia="en-GB"/>
-        </w:rPr>
-        <w:t>us</w:t>
-      </w:r>
-      <w:r>
-        <w:rPr>
-          <w:lang w:eastAsia="en-GB"/>
-        </w:rPr>
-        <w:t xml:space="preserve"> to analyse the characteristics and distributions of variables specifically for instances where machine failure occurred.</w:t>
+        <w:t xml:space="preserve">It allows us to analyse the characteristics and distributions of variables specifically for instances where machine failure occurred.</w:t>
       </w:r>
     </w:p>
     <w:p>
@@ -5997,23 +4431,13 @@
           <w:lang w:eastAsia="en-GB"/>
         </w:rPr>
       </w:pPr>
-      <w:proofErr w:type="spellStart"/>
       <w:r>
         <w:rPr>
           <w:b/>
           <w:bCs/>
           <w:lang w:eastAsia="en-GB"/>
         </w:rPr>
-        <w:t>Desc</w:t>
-      </w:r>
-      <w:proofErr w:type="spellEnd"/>
-      <w:r>
-        <w:rPr>
-          <w:b/>
-          <w:bCs/>
-          <w:lang w:eastAsia="en-GB"/>
-        </w:rPr>
-        <w:t>(data[ok_operation_row_indices, ])</w:t>
+        <w:t>Desc(data[ok_operation_row_indices, ])</w:t>
       </w:r>
       <w:r>
         <w:rPr>
@@ -6043,121 +4467,7 @@
         <w:rPr>
           <w:lang w:eastAsia="en-GB"/>
         </w:rPr>
-        <w:t>It describes</w:t>
-      </w:r>
-      <w:r>
-        <w:rPr>
-          <w:lang w:eastAsia="en-GB"/>
-        </w:rPr>
-        <w:t xml:space="preserve"> the </w:t>
-      </w:r>
-      <w:r>
-        <w:rPr>
-          <w:lang w:eastAsia="en-GB"/>
-        </w:rPr>
-        <w:t>partition</w:t>
-      </w:r>
-      <w:r>
-        <w:rPr>
-          <w:lang w:eastAsia="en-GB"/>
-        </w:rPr>
-        <w:t xml:space="preserve"> of the data</w:t>
-      </w:r>
-      <w:r>
-        <w:rPr>
-          <w:lang w:eastAsia="en-GB"/>
-        </w:rPr>
-        <w:t xml:space="preserve"> </w:t>
-      </w:r>
-      <w:r>
-        <w:rPr>
-          <w:lang w:eastAsia="en-GB"/>
-        </w:rPr>
-        <w:t xml:space="preserve">when the machine action was normal (FALSE). </w:t>
-      </w:r>
-      <w:r>
-        <w:rPr>
-          <w:lang w:eastAsia="en-GB"/>
-        </w:rPr>
-        <w:t xml:space="preserve">The blue </w:t>
-      </w:r>
-      <w:r>
-        <w:rPr>
-          <w:lang w:eastAsia="en-GB"/>
-        </w:rPr>
-        <w:t>part</w:t>
-      </w:r>
-      <w:r>
-        <w:rPr>
-          <w:lang w:eastAsia="en-GB"/>
-        </w:rPr>
-        <w:t xml:space="preserve"> represents instances where machine failure is marked as FALSE, total</w:t>
-      </w:r>
-      <w:r>
-        <w:rPr>
-          <w:lang w:eastAsia="en-GB"/>
-        </w:rPr>
-        <w:t>l</w:t>
-      </w:r>
-      <w:r>
-        <w:rPr>
-          <w:lang w:eastAsia="en-GB"/>
-        </w:rPr>
-        <w:t>ing 9,661</w:t>
-      </w:r>
-      <w:r>
-        <w:rPr>
-          <w:lang w:eastAsia="en-GB"/>
-        </w:rPr>
-        <w:t xml:space="preserve"> </w:t>
-      </w:r>
-      <w:r>
-        <w:rPr>
-          <w:lang w:eastAsia="en-GB"/>
-        </w:rPr>
-        <w:t xml:space="preserve">observations, which accounts for </w:t>
-      </w:r>
-      <w:r>
-        <w:rPr>
-          <w:lang w:eastAsia="en-GB"/>
-        </w:rPr>
-        <w:t>100</w:t>
-      </w:r>
-      <w:r>
-        <w:rPr>
-          <w:lang w:eastAsia="en-GB"/>
-        </w:rPr>
-        <w:t xml:space="preserve">% of the </w:t>
-      </w:r>
-      <w:r>
-        <w:rPr>
-          <w:lang w:eastAsia="en-GB"/>
-        </w:rPr>
-        <w:t>p</w:t>
-      </w:r>
-      <w:r>
-        <w:rPr>
-          <w:lang w:eastAsia="en-GB"/>
-        </w:rPr>
-        <w:t>a</w:t>
-      </w:r>
-      <w:r>
-        <w:rPr>
-          <w:lang w:eastAsia="en-GB"/>
-        </w:rPr>
-        <w:t>rti</w:t>
-      </w:r>
-      <w:r>
-        <w:rPr>
-          <w:lang w:eastAsia="en-GB"/>
-        </w:rPr>
-        <w:t>ti</w:t>
-      </w:r>
-      <w:r>
-        <w:rPr>
-          <w:lang w:eastAsia="en-GB"/>
-        </w:rPr>
-        <w:t xml:space="preserve">oned dataset. </w:t>
+        <w:t xml:space="preserve">This partition holds the 9,661 rows with normal operation. Desc() on it only reports the Machine_failure column, which is FALSE for every row by construction (100% in Appendix B), so it confirms the partition but gives no further information about the operating conditions. The comparison of the five operating variables between the two partitions is shown in the table below. </w:t>
       </w:r>
     </w:p>
     <w:p>
@@ -6168,214 +4478,6 @@
           <w:lang w:eastAsia="en-GB"/>
         </w:rPr>
       </w:pPr>
-    </w:p>
-    <w:p>
-      <w:pPr>
-        <w:pStyle w:val="ListParagraph"/>
-        <w:numPr>
-          <w:ilvl w:val="0"/>
-          <w:numId w:val="24"/>
-        </w:numPr>
-        <w:jc w:val="both"/>
-        <w:rPr>
-          <w:lang w:eastAsia="en-GB"/>
-        </w:rPr>
-      </w:pPr>
-      <w:r>
-        <w:rPr>
-          <w:lang w:eastAsia="en-GB"/>
-        </w:rPr>
-        <w:t xml:space="preserve">Length: The </w:t>
-      </w:r>
-      <w:r>
-        <w:rPr>
-          <w:lang w:eastAsia="en-GB"/>
-        </w:rPr>
-        <w:t>data</w:t>
-      </w:r>
-      <w:r>
-        <w:rPr>
-          <w:lang w:eastAsia="en-GB"/>
-        </w:rPr>
-        <w:t xml:space="preserve"> has 9,661 observations. </w:t>
-      </w:r>
-    </w:p>
-    <w:p>
-      <w:pPr>
-        <w:pStyle w:val="ListParagraph"/>
-        <w:numPr>
-          <w:ilvl w:val="0"/>
-          <w:numId w:val="24"/>
-        </w:numPr>
-        <w:jc w:val="both"/>
-        <w:rPr>
-          <w:lang w:eastAsia="en-GB"/>
-        </w:rPr>
-      </w:pPr>
-      <w:r>
-        <w:rPr>
-          <w:lang w:eastAsia="en-GB"/>
-        </w:rPr>
-        <w:t xml:space="preserve">n: All 9,661 observations are non-missing. </w:t>
-      </w:r>
-    </w:p>
-    <w:p>
-      <w:pPr>
-        <w:pStyle w:val="ListParagraph"/>
-        <w:numPr>
-          <w:ilvl w:val="0"/>
-          <w:numId w:val="24"/>
-        </w:numPr>
-        <w:jc w:val="both"/>
-        <w:rPr>
-          <w:lang w:eastAsia="en-GB"/>
-        </w:rPr>
-      </w:pPr>
-      <w:r>
-        <w:rPr>
-          <w:lang w:eastAsia="en-GB"/>
-        </w:rPr>
-        <w:t xml:space="preserve">NAs: There are no missing values in this </w:t>
-      </w:r>
-      <w:r>
-        <w:rPr>
-          <w:lang w:eastAsia="en-GB"/>
-        </w:rPr>
-        <w:t>data</w:t>
-      </w:r>
-      <w:r>
-        <w:rPr>
-          <w:lang w:eastAsia="en-GB"/>
-        </w:rPr>
-        <w:t xml:space="preserve">. </w:t>
-      </w:r>
-    </w:p>
-    <w:p>
-      <w:pPr>
-        <w:pStyle w:val="ListParagraph"/>
-        <w:numPr>
-          <w:ilvl w:val="0"/>
-          <w:numId w:val="24"/>
-        </w:numPr>
-        <w:jc w:val="both"/>
-        <w:rPr>
-          <w:lang w:eastAsia="en-GB"/>
-        </w:rPr>
-      </w:pPr>
-      <w:r>
-        <w:rPr>
-          <w:lang w:eastAsia="en-GB"/>
-        </w:rPr>
-        <w:lastRenderedPageBreak/>
-        <w:t xml:space="preserve">Unique: There is just one unique value (FALSE) in the </w:t>
-      </w:r>
-      <w:r>
-        <w:rPr>
-          <w:lang w:eastAsia="en-GB"/>
-        </w:rPr>
-        <w:t>data</w:t>
-      </w:r>
-      <w:r>
-        <w:rPr>
-          <w:lang w:eastAsia="en-GB"/>
-        </w:rPr>
-        <w:t xml:space="preserve">, indicating that all observations represent regular machine operation. </w:t>
-      </w:r>
-    </w:p>
-    <w:p>
-      <w:pPr>
-        <w:pStyle w:val="ListParagraph"/>
-        <w:numPr>
-          <w:ilvl w:val="0"/>
-          <w:numId w:val="24"/>
-        </w:numPr>
-        <w:jc w:val="both"/>
-        <w:rPr>
-          <w:lang w:eastAsia="en-GB"/>
-        </w:rPr>
-      </w:pPr>
-      <w:r>
-        <w:rPr>
-          <w:lang w:eastAsia="en-GB"/>
-        </w:rPr>
-        <w:t>Frequency (</w:t>
-      </w:r>
-      <w:proofErr w:type="spellStart"/>
-      <w:r>
-        <w:rPr>
-          <w:lang w:eastAsia="en-GB"/>
-        </w:rPr>
-        <w:t>freq</w:t>
-      </w:r>
-      <w:proofErr w:type="spellEnd"/>
-      <w:r>
-        <w:rPr>
-          <w:lang w:eastAsia="en-GB"/>
-        </w:rPr>
-        <w:t xml:space="preserve">): All 9,661 observations have the value FALSE, reflecting 100% of the </w:t>
-      </w:r>
-      <w:r>
-        <w:rPr>
-          <w:lang w:eastAsia="en-GB"/>
-        </w:rPr>
-        <w:t>data</w:t>
-      </w:r>
-      <w:r>
-        <w:rPr>
-          <w:lang w:eastAsia="en-GB"/>
-        </w:rPr>
-        <w:t xml:space="preserve">. </w:t>
-      </w:r>
-    </w:p>
-    <w:p>
-      <w:pPr>
-        <w:pStyle w:val="ListParagraph"/>
-        <w:numPr>
-          <w:ilvl w:val="0"/>
-          <w:numId w:val="24"/>
-        </w:numPr>
-        <w:jc w:val="both"/>
-        <w:rPr>
-          <w:lang w:eastAsia="en-GB"/>
-        </w:rPr>
-      </w:pPr>
-      <w:r>
-        <w:rPr>
-          <w:lang w:eastAsia="en-GB"/>
-        </w:rPr>
-        <w:t xml:space="preserve">Percentage (perc): 100% of the observations in the </w:t>
-      </w:r>
-      <w:r>
-        <w:rPr>
-          <w:lang w:eastAsia="en-GB"/>
-        </w:rPr>
-        <w:t>data</w:t>
-      </w:r>
-      <w:r>
-        <w:rPr>
-          <w:lang w:eastAsia="en-GB"/>
-        </w:rPr>
-        <w:t xml:space="preserve"> represent regular machine operation. </w:t>
-      </w:r>
-    </w:p>
-    <w:p>
-      <w:pPr>
-        <w:pStyle w:val="ListParagraph"/>
-        <w:numPr>
-          <w:ilvl w:val="0"/>
-          <w:numId w:val="24"/>
-        </w:numPr>
-        <w:jc w:val="both"/>
-        <w:rPr>
-          <w:lang w:eastAsia="en-GB"/>
-        </w:rPr>
-      </w:pPr>
-      <w:r>
-        <w:rPr>
-          <w:lang w:eastAsia="en-GB"/>
-        </w:rPr>
-        <w:t xml:space="preserve">95% Confidence Interval (95%-CI): The Wilson approach is used to determine the confidence interval, but in this case, it results in 100% for the lower and upper confidence intervals (lci.95 and uci.95), showing that the normal operation occurs with certainty within the dataset. </w:t>
-      </w:r>
     </w:p>
     <w:p>
       <w:pPr>
@@ -6398,23 +4500,13 @@
           <w:lang w:eastAsia="en-GB"/>
         </w:rPr>
       </w:pPr>
-      <w:proofErr w:type="spellStart"/>
       <w:r>
         <w:rPr>
           <w:b/>
           <w:bCs/>
           <w:lang w:eastAsia="en-GB"/>
         </w:rPr>
-        <w:t>Desc</w:t>
-      </w:r>
-      <w:proofErr w:type="spellEnd"/>
-      <w:r>
-        <w:rPr>
-          <w:b/>
-          <w:bCs/>
-          <w:lang w:eastAsia="en-GB"/>
-        </w:rPr>
-        <w:t>(data[fail_row_indices, ])</w:t>
+        <w:t>Desc(data[fail_row_indices, ])</w:t>
       </w:r>
       <w:r>
         <w:rPr>
@@ -6444,125 +4536,740 @@
         <w:rPr>
           <w:lang w:eastAsia="en-GB"/>
         </w:rPr>
-        <w:t xml:space="preserve">It </w:t>
-      </w:r>
-      <w:r>
-        <w:rPr>
-          <w:lang w:eastAsia="en-GB"/>
-        </w:rPr>
-        <w:t>descri</w:t>
-      </w:r>
-      <w:r>
-        <w:rPr>
-          <w:lang w:eastAsia="en-GB"/>
-        </w:rPr>
-        <w:t>bes</w:t>
-      </w:r>
-      <w:r>
-        <w:rPr>
-          <w:lang w:eastAsia="en-GB"/>
-        </w:rPr>
-        <w:t xml:space="preserve"> the </w:t>
-      </w:r>
-      <w:r>
-        <w:rPr>
-          <w:lang w:eastAsia="en-GB"/>
-        </w:rPr>
-        <w:t>partitioned dataset</w:t>
-      </w:r>
-      <w:r>
-        <w:rPr>
-          <w:lang w:eastAsia="en-GB"/>
-        </w:rPr>
-        <w:t xml:space="preserve"> where machine failure occurred, represented by the logical value TRUE. </w:t>
-      </w:r>
-      <w:r>
-        <w:rPr>
-          <w:lang w:eastAsia="en-GB"/>
-        </w:rPr>
-        <w:t xml:space="preserve">The blue </w:t>
-      </w:r>
-      <w:r>
-        <w:rPr>
-          <w:lang w:eastAsia="en-GB"/>
-        </w:rPr>
-        <w:t>part</w:t>
-      </w:r>
-      <w:r>
-        <w:rPr>
-          <w:lang w:eastAsia="en-GB"/>
-        </w:rPr>
-        <w:t xml:space="preserve"> represents instances where machine failure is marked as </w:t>
-      </w:r>
-      <w:r>
-        <w:rPr>
-          <w:lang w:eastAsia="en-GB"/>
-        </w:rPr>
-        <w:t>TRUE</w:t>
-      </w:r>
-      <w:r>
-        <w:rPr>
-          <w:lang w:eastAsia="en-GB"/>
-        </w:rPr>
-        <w:t>, total</w:t>
-      </w:r>
-      <w:r>
-        <w:rPr>
-          <w:lang w:eastAsia="en-GB"/>
-        </w:rPr>
-        <w:t>l</w:t>
-      </w:r>
-      <w:r>
-        <w:rPr>
-          <w:lang w:eastAsia="en-GB"/>
-        </w:rPr>
-        <w:t xml:space="preserve">ing </w:t>
-      </w:r>
-      <w:r>
-        <w:rPr>
-          <w:lang w:eastAsia="en-GB"/>
-        </w:rPr>
-        <w:t xml:space="preserve">339 </w:t>
-      </w:r>
-      <w:r>
-        <w:rPr>
-          <w:lang w:eastAsia="en-GB"/>
-        </w:rPr>
-        <w:t xml:space="preserve">observations, which accounts for </w:t>
-      </w:r>
-      <w:r>
-        <w:rPr>
-          <w:lang w:eastAsia="en-GB"/>
-        </w:rPr>
-        <w:t>100</w:t>
-      </w:r>
-      <w:r>
-        <w:rPr>
-          <w:lang w:eastAsia="en-GB"/>
-        </w:rPr>
-        <w:t xml:space="preserve">% of the </w:t>
-      </w:r>
-      <w:r>
-        <w:rPr>
-          <w:lang w:eastAsia="en-GB"/>
-        </w:rPr>
-        <w:t xml:space="preserve">partitioned dataset. </w:t>
-      </w:r>
-    </w:p>
-    <w:p>
-      <w:pPr>
-        <w:jc w:val="both"/>
-        <w:rPr>
-          <w:lang w:eastAsia="en-GB"/>
-        </w:rPr>
-      </w:pPr>
+        <w:t xml:space="preserve">This partition holds the 339 rows where a failure occurred. As above, Desc() only reports Machine_failure, which is TRUE for every row by construction (100% in Appendix C), so the confidence interval shown there carries no information. </w:t>
+      </w:r>
+    </w:p>
+    <w:p>
+      <w:pPr>
+        <w:jc w:val="both"/>
+        <w:rPr>
+          <w:lang w:eastAsia="en-GB"/>
+        </w:rPr>
+      </w:pPr>
+    </w:p>
+    <w:p>
+      <w:pPr>
+        <w:ind w:left="360"/>
+        <w:jc w:val="both"/>
+        <w:rPr>
+          <w:lang w:eastAsia="en-GB"/>
+        </w:rPr>
+      </w:pPr>
+    </w:p>
+    <w:p>
+      <w:pPr>
+        <w:ind w:left="360"/>
+        <w:jc w:val="both"/>
+        <w:rPr>
+          <w:b/>
+          <w:bCs/>
+          <w:lang w:eastAsia="en-GB"/>
+        </w:rPr>
+      </w:pPr>
+      <w:r>
+        <w:rPr>
+          <w:b/>
+          <w:bCs/>
+          <w:lang w:eastAsia="en-GB"/>
+        </w:rPr>
+        <w:t xml:space="preserve">Comparison of normal and failed operation</w:t>
+      </w:r>
+    </w:p>
+    <w:p>
+      <w:pPr>
+        <w:ind w:left="360"/>
+        <w:jc w:val="both"/>
+        <w:rPr>
+          <w:lang w:eastAsia="en-GB"/>
+        </w:rPr>
+      </w:pPr>
+      <w:r>
+        <w:rPr>
+          <w:lang w:eastAsia="en-GB"/>
+        </w:rPr>
+        <w:t xml:space="preserve">Table 1 compares the five operating variables between the 9,661 normal rows (summary(data[ok_operation_row_indices, ])) and the 339 failed rows (summary(data[fail_row_indices, ])). The p-values are from Wilcoxon rank-sum tests.</w:t>
+      </w:r>
+    </w:p>
+    <w:tbl>
+      <w:tblPr>
+        <w:tblW w:w="8600" w:type="dxa"/>
+        <w:tblInd w:w="360" w:type="dxa"/>
+        <w:tblBorders>
+          <w:top w:val="single" w:sz="4" w:space="0" w:color="808080"/>
+          <w:left w:val="single" w:sz="4" w:space="0" w:color="808080"/>
+          <w:bottom w:val="single" w:sz="4" w:space="0" w:color="808080"/>
+          <w:right w:val="single" w:sz="4" w:space="0" w:color="808080"/>
+          <w:insideH w:val="single" w:sz="4" w:space="0" w:color="808080"/>
+          <w:insideV w:val="single" w:sz="4" w:space="0" w:color="808080"/>
+        </w:tblBorders>
+        <w:tblLayout w:type="fixed"/>
+      </w:tblPr>
+      <w:tblGrid>
+        <w:gridCol w:w="2000"/>
+        <w:gridCol w:w="1300"/>
+        <w:gridCol w:w="1300"/>
+        <w:gridCol w:w="1300"/>
+        <w:gridCol w:w="1300"/>
+        <w:gridCol w:w="1400"/>
+      </w:tblGrid>
+      <w:tr>
+        <w:tc>
+          <w:tcPr>
+            <w:tcW w:w="2000" w:type="dxa"/>
+          </w:tcPr>
+          <w:p>
+            <w:pPr>
+              <w:spacing w:after="0"/>
+              <w:jc w:val="left"/>
+            </w:pPr>
+            <w:r>
+              <w:rPr>
+                <w:b/>
+                <w:bCs/>
+                <w:sz w:val="20"/>
+              </w:rPr>
+              <w:t xml:space="preserve">Variable</w:t>
+            </w:r>
+          </w:p>
+        </w:tc>
+        <w:tc>
+          <w:tcPr>
+            <w:tcW w:w="1300" w:type="dxa"/>
+          </w:tcPr>
+          <w:p>
+            <w:pPr>
+              <w:spacing w:after="0"/>
+              <w:jc w:val="center"/>
+            </w:pPr>
+            <w:r>
+              <w:rPr>
+                <w:b/>
+                <w:bCs/>
+                <w:sz w:val="20"/>
+              </w:rPr>
+              <w:t xml:space="preserve">Mean (normal)</w:t>
+            </w:r>
+          </w:p>
+        </w:tc>
+        <w:tc>
+          <w:tcPr>
+            <w:tcW w:w="1300" w:type="dxa"/>
+          </w:tcPr>
+          <w:p>
+            <w:pPr>
+              <w:spacing w:after="0"/>
+              <w:jc w:val="center"/>
+            </w:pPr>
+            <w:r>
+              <w:rPr>
+                <w:b/>
+                <w:bCs/>
+                <w:sz w:val="20"/>
+              </w:rPr>
+              <w:t xml:space="preserve">Mean (failed)</w:t>
+            </w:r>
+          </w:p>
+        </w:tc>
+        <w:tc>
+          <w:tcPr>
+            <w:tcW w:w="1300" w:type="dxa"/>
+          </w:tcPr>
+          <w:p>
+            <w:pPr>
+              <w:spacing w:after="0"/>
+              <w:jc w:val="center"/>
+            </w:pPr>
+            <w:r>
+              <w:rPr>
+                <w:b/>
+                <w:bCs/>
+                <w:sz w:val="20"/>
+              </w:rPr>
+              <w:t xml:space="preserve">Median (normal)</w:t>
+            </w:r>
+          </w:p>
+        </w:tc>
+        <w:tc>
+          <w:tcPr>
+            <w:tcW w:w="1300" w:type="dxa"/>
+          </w:tcPr>
+          <w:p>
+            <w:pPr>
+              <w:spacing w:after="0"/>
+              <w:jc w:val="center"/>
+            </w:pPr>
+            <w:r>
+              <w:rPr>
+                <w:b/>
+                <w:bCs/>
+                <w:sz w:val="20"/>
+              </w:rPr>
+              <w:t xml:space="preserve">Median (failed)</w:t>
+            </w:r>
+          </w:p>
+        </w:tc>
+        <w:tc>
+          <w:tcPr>
+            <w:tcW w:w="1400" w:type="dxa"/>
+          </w:tcPr>
+          <w:p>
+            <w:pPr>
+              <w:spacing w:after="0"/>
+              <w:jc w:val="center"/>
+            </w:pPr>
+            <w:r>
+              <w:rPr>
+                <w:b/>
+                <w:bCs/>
+                <w:sz w:val="20"/>
+              </w:rPr>
+              <w:t xml:space="preserve">Wilcoxon p</w:t>
+            </w:r>
+          </w:p>
+        </w:tc>
+      </w:tr>
+      <w:tr>
+        <w:tc>
+          <w:tcPr>
+            <w:tcW w:w="2000" w:type="dxa"/>
+          </w:tcPr>
+          <w:p>
+            <w:pPr>
+              <w:spacing w:after="0"/>
+              <w:jc w:val="left"/>
+            </w:pPr>
+            <w:r>
+              <w:rPr>
+                <w:sz w:val="20"/>
+              </w:rPr>
+              <w:t xml:space="preserve">Air temperature (K)</w:t>
+            </w:r>
+          </w:p>
+        </w:tc>
+        <w:tc>
+          <w:tcPr>
+            <w:tcW w:w="1300" w:type="dxa"/>
+          </w:tcPr>
+          <w:p>
+            <w:pPr>
+              <w:spacing w:after="0"/>
+              <w:jc w:val="center"/>
+            </w:pPr>
+            <w:r>
+              <w:rPr>
+                <w:sz w:val="20"/>
+              </w:rPr>
+              <w:t xml:space="preserve">299.97</w:t>
+            </w:r>
+          </w:p>
+        </w:tc>
+        <w:tc>
+          <w:tcPr>
+            <w:tcW w:w="1300" w:type="dxa"/>
+          </w:tcPr>
+          <w:p>
+            <w:pPr>
+              <w:spacing w:after="0"/>
+              <w:jc w:val="center"/>
+            </w:pPr>
+            <w:r>
+              <w:rPr>
+                <w:sz w:val="20"/>
+              </w:rPr>
+              <w:t xml:space="preserve">300.89</w:t>
+            </w:r>
+          </w:p>
+        </w:tc>
+        <w:tc>
+          <w:tcPr>
+            <w:tcW w:w="1300" w:type="dxa"/>
+          </w:tcPr>
+          <w:p>
+            <w:pPr>
+              <w:spacing w:after="0"/>
+              <w:jc w:val="center"/>
+            </w:pPr>
+            <w:r>
+              <w:rPr>
+                <w:sz w:val="20"/>
+              </w:rPr>
+              <w:t xml:space="preserve">300.0</w:t>
+            </w:r>
+          </w:p>
+        </w:tc>
+        <w:tc>
+          <w:tcPr>
+            <w:tcW w:w="1300" w:type="dxa"/>
+          </w:tcPr>
+          <w:p>
+            <w:pPr>
+              <w:spacing w:after="0"/>
+              <w:jc w:val="center"/>
+            </w:pPr>
+            <w:r>
+              <w:rPr>
+                <w:sz w:val="20"/>
+              </w:rPr>
+              <w:t xml:space="preserve">301.6</w:t>
+            </w:r>
+          </w:p>
+        </w:tc>
+        <w:tc>
+          <w:tcPr>
+            <w:tcW w:w="1400" w:type="dxa"/>
+          </w:tcPr>
+          <w:p>
+            <w:pPr>
+              <w:spacing w:after="0"/>
+              <w:jc w:val="center"/>
+            </w:pPr>
+            <w:r>
+              <w:rPr>
+                <w:sz w:val="20"/>
+              </w:rPr>
+              <w:t xml:space="preserve">&lt;0.001</w:t>
+            </w:r>
+          </w:p>
+        </w:tc>
+      </w:tr>
+      <w:tr>
+        <w:tc>
+          <w:tcPr>
+            <w:tcW w:w="2000" w:type="dxa"/>
+          </w:tcPr>
+          <w:p>
+            <w:pPr>
+              <w:spacing w:after="0"/>
+              <w:jc w:val="left"/>
+            </w:pPr>
+            <w:r>
+              <w:rPr>
+                <w:sz w:val="20"/>
+              </w:rPr>
+              <w:t xml:space="preserve">Process temperature (K)</w:t>
+            </w:r>
+          </w:p>
+        </w:tc>
+        <w:tc>
+          <w:tcPr>
+            <w:tcW w:w="1300" w:type="dxa"/>
+          </w:tcPr>
+          <w:p>
+            <w:pPr>
+              <w:spacing w:after="0"/>
+              <w:jc w:val="center"/>
+            </w:pPr>
+            <w:r>
+              <w:rPr>
+                <w:sz w:val="20"/>
+              </w:rPr>
+              <w:t xml:space="preserve">310.00</w:t>
+            </w:r>
+          </w:p>
+        </w:tc>
+        <w:tc>
+          <w:tcPr>
+            <w:tcW w:w="1300" w:type="dxa"/>
+          </w:tcPr>
+          <w:p>
+            <w:pPr>
+              <w:spacing w:after="0"/>
+              <w:jc w:val="center"/>
+            </w:pPr>
+            <w:r>
+              <w:rPr>
+                <w:sz w:val="20"/>
+              </w:rPr>
+              <w:t xml:space="preserve">310.23</w:t>
+            </w:r>
+          </w:p>
+        </w:tc>
+        <w:tc>
+          <w:tcPr>
+            <w:tcW w:w="1300" w:type="dxa"/>
+          </w:tcPr>
+          <w:p>
+            <w:pPr>
+              <w:spacing w:after="0"/>
+              <w:jc w:val="center"/>
+            </w:pPr>
+            <w:r>
+              <w:rPr>
+                <w:sz w:val="20"/>
+              </w:rPr>
+              <w:t xml:space="preserve">310.0</w:t>
+            </w:r>
+          </w:p>
+        </w:tc>
+        <w:tc>
+          <w:tcPr>
+            <w:tcW w:w="1300" w:type="dxa"/>
+          </w:tcPr>
+          <w:p>
+            <w:pPr>
+              <w:spacing w:after="0"/>
+              <w:jc w:val="center"/>
+            </w:pPr>
+            <w:r>
+              <w:rPr>
+                <w:sz w:val="20"/>
+              </w:rPr>
+              <w:t xml:space="preserve">310.4</w:t>
+            </w:r>
+          </w:p>
+        </w:tc>
+        <w:tc>
+          <w:tcPr>
+            <w:tcW w:w="1400" w:type="dxa"/>
+          </w:tcPr>
+          <w:p>
+            <w:pPr>
+              <w:spacing w:after="0"/>
+              <w:jc w:val="center"/>
+            </w:pPr>
+            <w:r>
+              <w:rPr>
+                <w:sz w:val="20"/>
+              </w:rPr>
+              <w:t xml:space="preserve">&lt;0.001</w:t>
+            </w:r>
+          </w:p>
+        </w:tc>
+      </w:tr>
+      <w:tr>
+        <w:tc>
+          <w:tcPr>
+            <w:tcW w:w="2000" w:type="dxa"/>
+          </w:tcPr>
+          <w:p>
+            <w:pPr>
+              <w:spacing w:after="0"/>
+              <w:jc w:val="left"/>
+            </w:pPr>
+            <w:r>
+              <w:rPr>
+                <w:sz w:val="20"/>
+              </w:rPr>
+              <w:t xml:space="preserve">Rotational speed (rpm)</w:t>
+            </w:r>
+          </w:p>
+        </w:tc>
+        <w:tc>
+          <w:tcPr>
+            <w:tcW w:w="1300" w:type="dxa"/>
+          </w:tcPr>
+          <w:p>
+            <w:pPr>
+              <w:spacing w:after="0"/>
+              <w:jc w:val="center"/>
+            </w:pPr>
+            <w:r>
+              <w:rPr>
+                <w:sz w:val="20"/>
+              </w:rPr>
+              <w:t xml:space="preserve">1540.3</w:t>
+            </w:r>
+          </w:p>
+        </w:tc>
+        <w:tc>
+          <w:tcPr>
+            <w:tcW w:w="1300" w:type="dxa"/>
+          </w:tcPr>
+          <w:p>
+            <w:pPr>
+              <w:spacing w:after="0"/>
+              <w:jc w:val="center"/>
+            </w:pPr>
+            <w:r>
+              <w:rPr>
+                <w:sz w:val="20"/>
+              </w:rPr>
+              <w:t xml:space="preserve">1498.2</w:t>
+            </w:r>
+          </w:p>
+        </w:tc>
+        <w:tc>
+          <w:tcPr>
+            <w:tcW w:w="1300" w:type="dxa"/>
+          </w:tcPr>
+          <w:p>
+            <w:pPr>
+              <w:spacing w:after="0"/>
+              <w:jc w:val="center"/>
+            </w:pPr>
+            <w:r>
+              <w:rPr>
+                <w:sz w:val="20"/>
+              </w:rPr>
+              <w:t xml:space="preserve">1507</w:t>
+            </w:r>
+          </w:p>
+        </w:tc>
+        <w:tc>
+          <w:tcPr>
+            <w:tcW w:w="1300" w:type="dxa"/>
+          </w:tcPr>
+          <w:p>
+            <w:pPr>
+              <w:spacing w:after="0"/>
+              <w:jc w:val="center"/>
+            </w:pPr>
+            <w:r>
+              <w:rPr>
+                <w:sz w:val="20"/>
+              </w:rPr>
+              <w:t xml:space="preserve">1365</w:t>
+            </w:r>
+          </w:p>
+        </w:tc>
+        <w:tc>
+          <w:tcPr>
+            <w:tcW w:w="1400" w:type="dxa"/>
+          </w:tcPr>
+          <w:p>
+            <w:pPr>
+              <w:spacing w:after="0"/>
+              <w:jc w:val="center"/>
+            </w:pPr>
+            <w:r>
+              <w:rPr>
+                <w:sz w:val="20"/>
+              </w:rPr>
+              <w:t xml:space="preserve">&lt;0.001</w:t>
+            </w:r>
+          </w:p>
+        </w:tc>
+      </w:tr>
+      <w:tr>
+        <w:tc>
+          <w:tcPr>
+            <w:tcW w:w="2000" w:type="dxa"/>
+          </w:tcPr>
+          <w:p>
+            <w:pPr>
+              <w:spacing w:after="0"/>
+              <w:jc w:val="left"/>
+            </w:pPr>
+            <w:r>
+              <w:rPr>
+                <w:sz w:val="20"/>
+              </w:rPr>
+              <w:t xml:space="preserve">Torque (Nm)</w:t>
+            </w:r>
+          </w:p>
+        </w:tc>
+        <w:tc>
+          <w:tcPr>
+            <w:tcW w:w="1300" w:type="dxa"/>
+          </w:tcPr>
+          <w:p>
+            <w:pPr>
+              <w:spacing w:after="0"/>
+              <w:jc w:val="center"/>
+            </w:pPr>
+            <w:r>
+              <w:rPr>
+                <w:sz w:val="20"/>
+              </w:rPr>
+              <w:t xml:space="preserve">39.62</w:t>
+            </w:r>
+          </w:p>
+        </w:tc>
+        <w:tc>
+          <w:tcPr>
+            <w:tcW w:w="1300" w:type="dxa"/>
+          </w:tcPr>
+          <w:p>
+            <w:pPr>
+              <w:spacing w:after="0"/>
+              <w:jc w:val="center"/>
+            </w:pPr>
+            <w:r>
+              <w:rPr>
+                <w:sz w:val="20"/>
+              </w:rPr>
+              <w:t xml:space="preserve">50.12</w:t>
+            </w:r>
+          </w:p>
+        </w:tc>
+        <w:tc>
+          <w:tcPr>
+            <w:tcW w:w="1300" w:type="dxa"/>
+          </w:tcPr>
+          <w:p>
+            <w:pPr>
+              <w:spacing w:after="0"/>
+              <w:jc w:val="center"/>
+            </w:pPr>
+            <w:r>
+              <w:rPr>
+                <w:sz w:val="20"/>
+              </w:rPr>
+              <w:t xml:space="preserve">39.8</w:t>
+            </w:r>
+          </w:p>
+        </w:tc>
+        <w:tc>
+          <w:tcPr>
+            <w:tcW w:w="1300" w:type="dxa"/>
+          </w:tcPr>
+          <w:p>
+            <w:pPr>
+              <w:spacing w:after="0"/>
+              <w:jc w:val="center"/>
+            </w:pPr>
+            <w:r>
+              <w:rPr>
+                <w:sz w:val="20"/>
+              </w:rPr>
+              <w:t xml:space="preserve">53.7</w:t>
+            </w:r>
+          </w:p>
+        </w:tc>
+        <w:tc>
+          <w:tcPr>
+            <w:tcW w:w="1400" w:type="dxa"/>
+          </w:tcPr>
+          <w:p>
+            <w:pPr>
+              <w:spacing w:after="0"/>
+              <w:jc w:val="center"/>
+            </w:pPr>
+            <w:r>
+              <w:rPr>
+                <w:sz w:val="20"/>
+              </w:rPr>
+              <w:t xml:space="preserve">&lt;0.001</w:t>
+            </w:r>
+          </w:p>
+        </w:tc>
+      </w:tr>
+      <w:tr>
+        <w:tc>
+          <w:tcPr>
+            <w:tcW w:w="2000" w:type="dxa"/>
+          </w:tcPr>
+          <w:p>
+            <w:pPr>
+              <w:spacing w:after="0"/>
+              <w:jc w:val="left"/>
+            </w:pPr>
+            <w:r>
+              <w:rPr>
+                <w:sz w:val="20"/>
+              </w:rPr>
+              <w:t xml:space="preserve">Tool wear (min)</w:t>
+            </w:r>
+          </w:p>
+        </w:tc>
+        <w:tc>
+          <w:tcPr>
+            <w:tcW w:w="1300" w:type="dxa"/>
+          </w:tcPr>
+          <w:p>
+            <w:pPr>
+              <w:spacing w:after="0"/>
+              <w:jc w:val="center"/>
+            </w:pPr>
+            <w:r>
+              <w:rPr>
+                <w:sz w:val="20"/>
+              </w:rPr>
+              <w:t xml:space="preserve">106.7</w:t>
+            </w:r>
+          </w:p>
+        </w:tc>
+        <w:tc>
+          <w:tcPr>
+            <w:tcW w:w="1300" w:type="dxa"/>
+          </w:tcPr>
+          <w:p>
+            <w:pPr>
+              <w:spacing w:after="0"/>
+              <w:jc w:val="center"/>
+            </w:pPr>
+            <w:r>
+              <w:rPr>
+                <w:sz w:val="20"/>
+              </w:rPr>
+              <w:t xml:space="preserve">145.2</w:t>
+            </w:r>
+          </w:p>
+        </w:tc>
+        <w:tc>
+          <w:tcPr>
+            <w:tcW w:w="1300" w:type="dxa"/>
+          </w:tcPr>
+          <w:p>
+            <w:pPr>
+              <w:spacing w:after="0"/>
+              <w:jc w:val="center"/>
+            </w:pPr>
+            <w:r>
+              <w:rPr>
+                <w:sz w:val="20"/>
+              </w:rPr>
+              <w:t xml:space="preserve">107</w:t>
+            </w:r>
+          </w:p>
+        </w:tc>
+        <w:tc>
+          <w:tcPr>
+            <w:tcW w:w="1300" w:type="dxa"/>
+          </w:tcPr>
+          <w:p>
+            <w:pPr>
+              <w:spacing w:after="0"/>
+              <w:jc w:val="center"/>
+            </w:pPr>
+            <w:r>
+              <w:rPr>
+                <w:sz w:val="20"/>
+              </w:rPr>
+              <w:t xml:space="preserve">168</w:t>
+            </w:r>
+          </w:p>
+        </w:tc>
+        <w:tc>
+          <w:tcPr>
+            <w:tcW w:w="1400" w:type="dxa"/>
+          </w:tcPr>
+          <w:p>
+            <w:pPr>
+              <w:spacing w:after="0"/>
+              <w:jc w:val="center"/>
+            </w:pPr>
+            <w:r>
+              <w:rPr>
+                <w:sz w:val="20"/>
+              </w:rPr>
+              <w:t xml:space="preserve">&lt;0.001</w:t>
+            </w:r>
+          </w:p>
+        </w:tc>
+      </w:tr>
+    </w:tbl>
+    <w:p>
+      <w:pPr>
+        <w:ind w:left="360"/>
+        <w:jc w:val="both"/>
+        <w:rPr>
+          <w:lang w:eastAsia="en-GB"/>
+        </w:rPr>
+      </w:pPr>
+      <w:r>
+        <w:rPr>
+          <w:lang w:eastAsia="en-GB"/>
+        </w:rPr>
+        <w:t xml:space="preserve">Table 1: Operating variables for normal and failed operation</w:t>
+      </w:r>
     </w:p>
     <w:p>
       <w:pPr>
         <w:pStyle w:val="ListParagraph"/>
         <w:numPr>
           <w:ilvl w:val="0"/>
-          <w:numId w:val="25"/>
+          <w:numId w:val="24"/>
         </w:numPr>
         <w:jc w:val="both"/>
         <w:rPr>
@@ -6571,21 +5278,17 @@
       </w:pPr>
       <w:r>
         <w:rPr>
-          <w:lang w:eastAsia="en-GB"/>
-        </w:rPr>
-        <w:t xml:space="preserve">Length: The </w:t>
-      </w:r>
-      <w:r>
-        <w:rPr>
-          <w:lang w:eastAsia="en-GB"/>
-        </w:rPr>
-        <w:t>data</w:t>
-      </w:r>
-      <w:r>
-        <w:rPr>
-          <w:lang w:eastAsia="en-GB"/>
-        </w:rPr>
-        <w:t xml:space="preserve"> contains 339 observations where machine failure occurred. </w:t>
+          <w:b/>
+          <w:bCs/>
+          <w:lang w:eastAsia="en-GB"/>
+        </w:rPr>
+        <w:t xml:space="preserve">Torque: </w:t>
+      </w:r>
+      <w:r>
+        <w:rPr>
+          <w:lang w:eastAsia="en-GB"/>
+        </w:rPr>
+        <w:t xml:space="preserve">failed rows average 50.1 Nm against 39.6 Nm (median 53.7 against 39.8 Nm). This is the clearest difference: 42% of the 236 rows with torque above 60 Nm failed, against 3.4% overall.</w:t>
       </w:r>
     </w:p>
     <w:p>
@@ -6593,7 +5296,7 @@
         <w:pStyle w:val="ListParagraph"/>
         <w:numPr>
           <w:ilvl w:val="0"/>
-          <w:numId w:val="25"/>
+          <w:numId w:val="24"/>
         </w:numPr>
         <w:jc w:val="both"/>
         <w:rPr>
@@ -6602,9 +5305,17 @@
       </w:pPr>
       <w:r>
         <w:rPr>
-          <w:lang w:eastAsia="en-GB"/>
-        </w:rPr>
-        <w:t xml:space="preserve">n: All 339 observations are non-missing. </w:t>
+          <w:b/>
+          <w:bCs/>
+          <w:lang w:eastAsia="en-GB"/>
+        </w:rPr>
+        <w:t xml:space="preserve">Tool wear: </w:t>
+      </w:r>
+      <w:r>
+        <w:rPr>
+          <w:lang w:eastAsia="en-GB"/>
+        </w:rPr>
+        <w:t xml:space="preserve">failed rows average 145 minutes against 107 minutes (median 168 against 107). Of the 765 rows with more than 200 minutes of wear, 15.8% failed.</w:t>
       </w:r>
     </w:p>
     <w:p>
@@ -6612,7 +5323,7 @@
         <w:pStyle w:val="ListParagraph"/>
         <w:numPr>
           <w:ilvl w:val="0"/>
-          <w:numId w:val="25"/>
+          <w:numId w:val="24"/>
         </w:numPr>
         <w:jc w:val="both"/>
         <w:rPr>
@@ -6621,21 +5332,17 @@
       </w:pPr>
       <w:r>
         <w:rPr>
-          <w:lang w:eastAsia="en-GB"/>
-        </w:rPr>
-        <w:t xml:space="preserve">NAs: There are no missing values in this </w:t>
-      </w:r>
-      <w:r>
-        <w:rPr>
-          <w:lang w:eastAsia="en-GB"/>
-        </w:rPr>
-        <w:t>data</w:t>
-      </w:r>
-      <w:r>
-        <w:rPr>
-          <w:lang w:eastAsia="en-GB"/>
-        </w:rPr>
-        <w:t xml:space="preserve">. </w:t>
+          <w:b/>
+          <w:bCs/>
+          <w:lang w:eastAsia="en-GB"/>
+        </w:rPr>
+        <w:t xml:space="preserve">Rotational speed: </w:t>
+      </w:r>
+      <w:r>
+        <w:rPr>
+          <w:lang w:eastAsia="en-GB"/>
+        </w:rPr>
+        <w:t xml:space="preserve">the median is lower for failures (1365 against 1507 rpm), yet the very high speeds (above 2000 rpm, 226 rows) also fail more often (14.6%). The relationship is therefore not a simple straight line.</w:t>
       </w:r>
     </w:p>
     <w:p>
@@ -6643,7 +5350,7 @@
         <w:pStyle w:val="ListParagraph"/>
         <w:numPr>
           <w:ilvl w:val="0"/>
-          <w:numId w:val="25"/>
+          <w:numId w:val="24"/>
         </w:numPr>
         <w:jc w:val="both"/>
         <w:rPr>
@@ -6652,104 +5359,17 @@
       </w:pPr>
       <w:r>
         <w:rPr>
-          <w:lang w:eastAsia="en-GB"/>
-        </w:rPr>
-        <w:t xml:space="preserve">Unique: There is just one unique value (TRUE) in the </w:t>
-      </w:r>
-      <w:r>
-        <w:rPr>
-          <w:lang w:eastAsia="en-GB"/>
-        </w:rPr>
-        <w:t>data</w:t>
-      </w:r>
-      <w:r>
-        <w:rPr>
-          <w:lang w:eastAsia="en-GB"/>
-        </w:rPr>
-        <w:t xml:space="preserve">, suggesting that all observations represent machine failure. </w:t>
-      </w:r>
-    </w:p>
-    <w:p>
-      <w:pPr>
-        <w:pStyle w:val="ListParagraph"/>
-        <w:numPr>
-          <w:ilvl w:val="0"/>
-          <w:numId w:val="25"/>
-        </w:numPr>
-        <w:jc w:val="both"/>
-        <w:rPr>
-          <w:lang w:eastAsia="en-GB"/>
-        </w:rPr>
-      </w:pPr>
-      <w:r>
-        <w:rPr>
-          <w:lang w:eastAsia="en-GB"/>
-        </w:rPr>
-        <w:t>Frequency (</w:t>
-      </w:r>
-      <w:proofErr w:type="spellStart"/>
-      <w:r>
-        <w:rPr>
-          <w:lang w:eastAsia="en-GB"/>
-        </w:rPr>
-        <w:t>freq</w:t>
-      </w:r>
-      <w:proofErr w:type="spellEnd"/>
-      <w:r>
-        <w:rPr>
-          <w:lang w:eastAsia="en-GB"/>
-        </w:rPr>
-        <w:t xml:space="preserve">): All 339 observations have the value TRUE, signifying 100% of the subgroup. </w:t>
-      </w:r>
-    </w:p>
-    <w:p>
-      <w:pPr>
-        <w:pStyle w:val="ListParagraph"/>
-        <w:numPr>
-          <w:ilvl w:val="0"/>
-          <w:numId w:val="25"/>
-        </w:numPr>
-        <w:jc w:val="both"/>
-        <w:rPr>
-          <w:lang w:eastAsia="en-GB"/>
-        </w:rPr>
-      </w:pPr>
-      <w:r>
-        <w:rPr>
-          <w:lang w:eastAsia="en-GB"/>
-        </w:rPr>
-        <w:t xml:space="preserve">Percentage (perc): 100% of the observations in the </w:t>
-      </w:r>
-      <w:r>
-        <w:rPr>
-          <w:lang w:eastAsia="en-GB"/>
-        </w:rPr>
-        <w:t>data</w:t>
-      </w:r>
-      <w:r>
-        <w:rPr>
-          <w:lang w:eastAsia="en-GB"/>
-        </w:rPr>
-        <w:t xml:space="preserve"> represent machine failure. </w:t>
-      </w:r>
-    </w:p>
-    <w:p>
-      <w:pPr>
-        <w:pStyle w:val="ListParagraph"/>
-        <w:numPr>
-          <w:ilvl w:val="0"/>
-          <w:numId w:val="25"/>
-        </w:numPr>
-        <w:jc w:val="both"/>
-        <w:rPr>
-          <w:lang w:eastAsia="en-GB"/>
-        </w:rPr>
-      </w:pPr>
-      <w:r>
-        <w:rPr>
-          <w:lang w:eastAsia="en-GB"/>
-        </w:rPr>
-        <w:t xml:space="preserve">95% Confidence Interval (95%-CI): The Wilson method is used to compute the confidence interval. </w:t>
+          <w:b/>
+          <w:bCs/>
+          <w:lang w:eastAsia="en-GB"/>
+        </w:rPr>
+        <w:t xml:space="preserve">Temperatures: </w:t>
+      </w:r>
+      <w:r>
+        <w:rPr>
+          <w:lang w:eastAsia="en-GB"/>
+        </w:rPr>
+        <w:t xml:space="preserve">air temperature is slightly higher in failed rows (300.9 against 300.0 K) and process temperature is almost identical (310.2 against 310.0 K). The difference is statistically detectable with 10,000 rows but small in practical terms.</w:t>
       </w:r>
     </w:p>
     <w:p>
@@ -6760,32 +5380,11 @@
           <w:lang w:eastAsia="en-GB"/>
         </w:rPr>
       </w:pPr>
-    </w:p>
-    <w:p>
-      <w:pPr>
-        <w:ind w:left="360"/>
-        <w:jc w:val="both"/>
-        <w:rPr>
-          <w:lang w:eastAsia="en-GB"/>
-        </w:rPr>
-      </w:pPr>
-      <w:r>
-        <w:rPr>
-          <w:lang w:eastAsia="en-GB"/>
-        </w:rPr>
-        <w:t xml:space="preserve">In this </w:t>
-      </w:r>
-      <w:r>
-        <w:rPr>
-          <w:lang w:eastAsia="en-GB"/>
-        </w:rPr>
-        <w:t>image</w:t>
-      </w:r>
-      <w:r>
-        <w:rPr>
-          <w:lang w:eastAsia="en-GB"/>
-        </w:rPr>
-        <w:t>, the lower confidence interval (lci.95) is 98.9%, and the upper confidence interval (uci.95) is 100.0%, suggesting with high certainty that machine failure is present within the dataset.</w:t>
+      <w:r>
+        <w:rPr>
+          <w:lang w:eastAsia="en-GB"/>
+        </w:rPr>
+        <w:t xml:space="preserve">Interpretation: torque, tool wear and rotational speed look the most useful for telling failures from normal operation, so they are the strongest candidates for the prediction models. Because the failures sit at the extremes of these variables, the unusually high or low values (for example, the high-speed tail of rotational speed) are informative rather than data errors and should not be removed as outliers during data preparation.</w:t>
       </w:r>
     </w:p>
     <w:p>
@@ -7076,12 +5675,6 @@
           <w:lang w:eastAsia="en-GB"/>
         </w:rPr>
         <w:br/>
-      </w:r>
-      <w:r>
-        <w:rPr>
-          <w:noProof/>
-          <w:lang w:eastAsia="en-GB"/>
-        </w:rPr>
         <w:drawing>
           <wp:inline distT="0" distB="0" distL="0" distR="0">
             <wp:extent cx="6080760" cy="2255520"/>

</xml_diff>